<commit_message>
Empaquetado para entrega a repositorio
</commit_message>
<xml_diff>
--- a/fuentes/CFA3_124108_DU.docx
+++ b/fuentes/CFA3_124108_DU.docx
@@ -610,7 +610,7 @@
           <w:r>
             <w:fldChar w:fldCharType="separate"/>
           </w:r>
-          <w:hyperlink w:anchor="_Toc225966790" w:history="1">
+          <w:hyperlink w:anchor="_Toc227072219" w:history="1">
             <w:r>
               <w:rPr>
                 <w:rStyle w:val="Hipervnculo"/>
@@ -637,7 +637,7 @@
                 <w:noProof/>
                 <w:webHidden/>
               </w:rPr>
-              <w:instrText xml:space="preserve"> PAGEREF _Toc225966790 \h </w:instrText>
+              <w:instrText xml:space="preserve"> PAGEREF _Toc227072219 \h </w:instrText>
             </w:r>
             <w:r>
               <w:rPr>
@@ -683,7 +683,7 @@
               <w:lang w:eastAsia="es-CO"/>
             </w:rPr>
           </w:pPr>
-          <w:hyperlink w:anchor="_Toc225966791" w:history="1">
+          <w:hyperlink w:anchor="_Toc227072220" w:history="1">
             <w:r>
               <w:rPr>
                 <w:rStyle w:val="Hipervnculo"/>
@@ -727,7 +727,7 @@
                 <w:noProof/>
                 <w:webHidden/>
               </w:rPr>
-              <w:instrText xml:space="preserve"> PAGEREF _Toc225966791 \h </w:instrText>
+              <w:instrText xml:space="preserve"> PAGEREF _Toc227072220 \h </w:instrText>
             </w:r>
             <w:r>
               <w:rPr>
@@ -769,7 +769,7 @@
               <w:lang w:eastAsia="es-CO"/>
             </w:rPr>
           </w:pPr>
-          <w:hyperlink w:anchor="_Toc225966792" w:history="1">
+          <w:hyperlink w:anchor="_Toc227072221" w:history="1">
             <w:r>
               <w:rPr>
                 <w:rStyle w:val="Hipervnculo"/>
@@ -813,7 +813,7 @@
                 <w:noProof/>
                 <w:webHidden/>
               </w:rPr>
-              <w:instrText xml:space="preserve"> PAGEREF _Toc225966792 \h </w:instrText>
+              <w:instrText xml:space="preserve"> PAGEREF _Toc227072221 \h </w:instrText>
             </w:r>
             <w:r>
               <w:rPr>
@@ -855,7 +855,7 @@
               <w:lang w:eastAsia="es-CO"/>
             </w:rPr>
           </w:pPr>
-          <w:hyperlink w:anchor="_Toc225966793" w:history="1">
+          <w:hyperlink w:anchor="_Toc227072222" w:history="1">
             <w:r>
               <w:rPr>
                 <w:rStyle w:val="Hipervnculo"/>
@@ -899,7 +899,7 @@
                 <w:noProof/>
                 <w:webHidden/>
               </w:rPr>
-              <w:instrText xml:space="preserve"> PAGEREF _Toc225966793 \h </w:instrText>
+              <w:instrText xml:space="preserve"> PAGEREF _Toc227072222 \h </w:instrText>
             </w:r>
             <w:r>
               <w:rPr>
@@ -945,7 +945,7 @@
               <w:lang w:eastAsia="es-CO"/>
             </w:rPr>
           </w:pPr>
-          <w:hyperlink w:anchor="_Toc225966794" w:history="1">
+          <w:hyperlink w:anchor="_Toc227072223" w:history="1">
             <w:r>
               <w:rPr>
                 <w:rStyle w:val="Hipervnculo"/>
@@ -989,7 +989,7 @@
                 <w:noProof/>
                 <w:webHidden/>
               </w:rPr>
-              <w:instrText xml:space="preserve"> PAGEREF _Toc225966794 \h </w:instrText>
+              <w:instrText xml:space="preserve"> PAGEREF _Toc227072223 \h </w:instrText>
             </w:r>
             <w:r>
               <w:rPr>
@@ -1031,7 +1031,7 @@
               <w:lang w:eastAsia="es-CO"/>
             </w:rPr>
           </w:pPr>
-          <w:hyperlink w:anchor="_Toc225966795" w:history="1">
+          <w:hyperlink w:anchor="_Toc227072224" w:history="1">
             <w:r>
               <w:rPr>
                 <w:rStyle w:val="Hipervnculo"/>
@@ -1075,7 +1075,7 @@
                 <w:noProof/>
                 <w:webHidden/>
               </w:rPr>
-              <w:instrText xml:space="preserve"> PAGEREF _Toc225966795 \h </w:instrText>
+              <w:instrText xml:space="preserve"> PAGEREF _Toc227072224 \h </w:instrText>
             </w:r>
             <w:r>
               <w:rPr>
@@ -1117,7 +1117,7 @@
               <w:lang w:eastAsia="es-CO"/>
             </w:rPr>
           </w:pPr>
-          <w:hyperlink w:anchor="_Toc225966796" w:history="1">
+          <w:hyperlink w:anchor="_Toc227072225" w:history="1">
             <w:r>
               <w:rPr>
                 <w:rStyle w:val="Hipervnculo"/>
@@ -1161,7 +1161,7 @@
                 <w:noProof/>
                 <w:webHidden/>
               </w:rPr>
-              <w:instrText xml:space="preserve"> PAGEREF _Toc225966796 \h </w:instrText>
+              <w:instrText xml:space="preserve"> PAGEREF _Toc227072225 \h </w:instrText>
             </w:r>
             <w:r>
               <w:rPr>
@@ -1203,7 +1203,7 @@
               <w:lang w:eastAsia="es-CO"/>
             </w:rPr>
           </w:pPr>
-          <w:hyperlink w:anchor="_Toc225966797" w:history="1">
+          <w:hyperlink w:anchor="_Toc227072226" w:history="1">
             <w:r>
               <w:rPr>
                 <w:rStyle w:val="Hipervnculo"/>
@@ -1263,7 +1263,7 @@
                 <w:noProof/>
                 <w:webHidden/>
               </w:rPr>
-              <w:instrText xml:space="preserve"> PAGEREF _Toc225966797 \h </w:instrText>
+              <w:instrText xml:space="preserve"> PAGEREF _Toc227072226 \h </w:instrText>
             </w:r>
             <w:r>
               <w:rPr>
@@ -1305,7 +1305,7 @@
               <w:lang w:eastAsia="es-CO"/>
             </w:rPr>
           </w:pPr>
-          <w:hyperlink w:anchor="_Toc225966798" w:history="1">
+          <w:hyperlink w:anchor="_Toc227072227" w:history="1">
             <w:r>
               <w:rPr>
                 <w:rStyle w:val="Hipervnculo"/>
@@ -1349,7 +1349,7 @@
                 <w:noProof/>
                 <w:webHidden/>
               </w:rPr>
-              <w:instrText xml:space="preserve"> PAGEREF _Toc225966798 \h </w:instrText>
+              <w:instrText xml:space="preserve"> PAGEREF _Toc227072227 \h </w:instrText>
             </w:r>
             <w:r>
               <w:rPr>
@@ -1395,7 +1395,7 @@
               <w:lang w:eastAsia="es-CO"/>
             </w:rPr>
           </w:pPr>
-          <w:hyperlink w:anchor="_Toc225966799" w:history="1">
+          <w:hyperlink w:anchor="_Toc227072228" w:history="1">
             <w:r>
               <w:rPr>
                 <w:rStyle w:val="Hipervnculo"/>
@@ -1439,7 +1439,7 @@
                 <w:noProof/>
                 <w:webHidden/>
               </w:rPr>
-              <w:instrText xml:space="preserve"> PAGEREF _Toc225966799 \h </w:instrText>
+              <w:instrText xml:space="preserve"> PAGEREF _Toc227072228 \h </w:instrText>
             </w:r>
             <w:r>
               <w:rPr>
@@ -1481,7 +1481,7 @@
               <w:lang w:eastAsia="es-CO"/>
             </w:rPr>
           </w:pPr>
-          <w:hyperlink w:anchor="_Toc225966800" w:history="1">
+          <w:hyperlink w:anchor="_Toc227072229" w:history="1">
             <w:r>
               <w:rPr>
                 <w:rStyle w:val="Hipervnculo"/>
@@ -1525,7 +1525,7 @@
                 <w:noProof/>
                 <w:webHidden/>
               </w:rPr>
-              <w:instrText xml:space="preserve"> PAGEREF _Toc225966800 \h </w:instrText>
+              <w:instrText xml:space="preserve"> PAGEREF _Toc227072229 \h </w:instrText>
             </w:r>
             <w:r>
               <w:rPr>
@@ -1567,7 +1567,7 @@
               <w:lang w:eastAsia="es-CO"/>
             </w:rPr>
           </w:pPr>
-          <w:hyperlink w:anchor="_Toc225966801" w:history="1">
+          <w:hyperlink w:anchor="_Toc227072230" w:history="1">
             <w:r>
               <w:rPr>
                 <w:rStyle w:val="Hipervnculo"/>
@@ -1611,7 +1611,7 @@
                 <w:noProof/>
                 <w:webHidden/>
               </w:rPr>
-              <w:instrText xml:space="preserve"> PAGEREF _Toc225966801 \h </w:instrText>
+              <w:instrText xml:space="preserve"> PAGEREF _Toc227072230 \h </w:instrText>
             </w:r>
             <w:r>
               <w:rPr>
@@ -1653,7 +1653,7 @@
               <w:lang w:eastAsia="es-CO"/>
             </w:rPr>
           </w:pPr>
-          <w:hyperlink w:anchor="_Toc225966802" w:history="1">
+          <w:hyperlink w:anchor="_Toc227072231" w:history="1">
             <w:r>
               <w:rPr>
                 <w:rStyle w:val="Hipervnculo"/>
@@ -1697,7 +1697,7 @@
                 <w:noProof/>
                 <w:webHidden/>
               </w:rPr>
-              <w:instrText xml:space="preserve"> PAGEREF _Toc225966802 \h </w:instrText>
+              <w:instrText xml:space="preserve"> PAGEREF _Toc227072231 \h </w:instrText>
             </w:r>
             <w:r>
               <w:rPr>
@@ -1739,7 +1739,7 @@
               <w:lang w:eastAsia="es-CO"/>
             </w:rPr>
           </w:pPr>
-          <w:hyperlink w:anchor="_Toc225966803" w:history="1">
+          <w:hyperlink w:anchor="_Toc227072232" w:history="1">
             <w:r>
               <w:rPr>
                 <w:rStyle w:val="Hipervnculo"/>
@@ -1783,7 +1783,7 @@
                 <w:noProof/>
                 <w:webHidden/>
               </w:rPr>
-              <w:instrText xml:space="preserve"> PAGEREF _Toc225966803 \h </w:instrText>
+              <w:instrText xml:space="preserve"> PAGEREF _Toc227072232 \h </w:instrText>
             </w:r>
             <w:r>
               <w:rPr>
@@ -1830,7 +1830,7 @@
               <w:lang w:eastAsia="es-CO"/>
             </w:rPr>
           </w:pPr>
-          <w:hyperlink w:anchor="_Toc225966804" w:history="1">
+          <w:hyperlink w:anchor="_Toc227072233" w:history="1">
             <w:r>
               <w:rPr>
                 <w:rStyle w:val="Hipervnculo"/>
@@ -1857,15 +1857,15 @@
             </w:r>
             <w:r>
               <w:rPr>
-                <w:rStyle w:val="Hipervnculo"/>
-                <w:noProof/>
+                <w:noProof/>
+                <w:webHidden/>
               </w:rPr>
               <w:tab/>
             </w:r>
             <w:r>
               <w:rPr>
-                <w:rStyle w:val="Hipervnculo"/>
-                <w:noProof/>
+                <w:noProof/>
+                <w:webHidden/>
               </w:rPr>
               <w:tab/>
             </w:r>
@@ -1888,7 +1888,7 @@
                 <w:noProof/>
                 <w:webHidden/>
               </w:rPr>
-              <w:instrText xml:space="preserve"> PAGEREF _Toc225966804 \h </w:instrText>
+              <w:instrText xml:space="preserve"> PAGEREF _Toc227072233 \h </w:instrText>
             </w:r>
             <w:r>
               <w:rPr>
@@ -1930,7 +1930,7 @@
               <w:lang w:eastAsia="es-CO"/>
             </w:rPr>
           </w:pPr>
-          <w:hyperlink w:anchor="_Toc225966805" w:history="1">
+          <w:hyperlink w:anchor="_Toc227072234" w:history="1">
             <w:r>
               <w:rPr>
                 <w:rStyle w:val="Hipervnculo"/>
@@ -1974,7 +1974,7 @@
                 <w:noProof/>
                 <w:webHidden/>
               </w:rPr>
-              <w:instrText xml:space="preserve"> PAGEREF _Toc225966805 \h </w:instrText>
+              <w:instrText xml:space="preserve"> PAGEREF _Toc227072234 \h </w:instrText>
             </w:r>
             <w:r>
               <w:rPr>
@@ -2016,7 +2016,7 @@
               <w:lang w:eastAsia="es-CO"/>
             </w:rPr>
           </w:pPr>
-          <w:hyperlink w:anchor="_Toc225966806" w:history="1">
+          <w:hyperlink w:anchor="_Toc227072235" w:history="1">
             <w:r>
               <w:rPr>
                 <w:rStyle w:val="Hipervnculo"/>
@@ -2060,7 +2060,7 @@
                 <w:noProof/>
                 <w:webHidden/>
               </w:rPr>
-              <w:instrText xml:space="preserve"> PAGEREF _Toc225966806 \h </w:instrText>
+              <w:instrText xml:space="preserve"> PAGEREF _Toc227072235 \h </w:instrText>
             </w:r>
             <w:r>
               <w:rPr>
@@ -2105,7 +2105,7 @@
               <w:lang w:eastAsia="es-CO"/>
             </w:rPr>
           </w:pPr>
-          <w:hyperlink w:anchor="_Toc225966807" w:history="1">
+          <w:hyperlink w:anchor="_Toc227072236" w:history="1">
             <w:r>
               <w:rPr>
                 <w:rStyle w:val="Hipervnculo"/>
@@ -2132,7 +2132,7 @@
                 <w:noProof/>
                 <w:webHidden/>
               </w:rPr>
-              <w:instrText xml:space="preserve"> PAGEREF _Toc225966807 \h </w:instrText>
+              <w:instrText xml:space="preserve"> PAGEREF _Toc227072236 \h </w:instrText>
             </w:r>
             <w:r>
               <w:rPr>
@@ -2177,7 +2177,7 @@
               <w:lang w:eastAsia="es-CO"/>
             </w:rPr>
           </w:pPr>
-          <w:hyperlink w:anchor="_Toc225966808" w:history="1">
+          <w:hyperlink w:anchor="_Toc227072237" w:history="1">
             <w:r>
               <w:rPr>
                 <w:rStyle w:val="Hipervnculo"/>
@@ -2204,7 +2204,7 @@
                 <w:noProof/>
                 <w:webHidden/>
               </w:rPr>
-              <w:instrText xml:space="preserve"> PAGEREF _Toc225966808 \h </w:instrText>
+              <w:instrText xml:space="preserve"> PAGEREF _Toc227072237 \h </w:instrText>
             </w:r>
             <w:r>
               <w:rPr>
@@ -2224,7 +2224,7 @@
                 <w:noProof/>
                 <w:webHidden/>
               </w:rPr>
-              <w:t>26</w:t>
+              <w:t>25</w:t>
             </w:r>
             <w:r>
               <w:rPr>
@@ -2249,7 +2249,7 @@
               <w:lang w:eastAsia="es-CO"/>
             </w:rPr>
           </w:pPr>
-          <w:hyperlink w:anchor="_Toc225966809" w:history="1">
+          <w:hyperlink w:anchor="_Toc227072238" w:history="1">
             <w:r>
               <w:rPr>
                 <w:rStyle w:val="Hipervnculo"/>
@@ -2276,7 +2276,7 @@
                 <w:noProof/>
                 <w:webHidden/>
               </w:rPr>
-              <w:instrText xml:space="preserve"> PAGEREF _Toc225966809 \h </w:instrText>
+              <w:instrText xml:space="preserve"> PAGEREF _Toc227072238 \h </w:instrText>
             </w:r>
             <w:r>
               <w:rPr>
@@ -2296,7 +2296,7 @@
                 <w:noProof/>
                 <w:webHidden/>
               </w:rPr>
-              <w:t>27</w:t>
+              <w:t>26</w:t>
             </w:r>
             <w:r>
               <w:rPr>
@@ -2321,7 +2321,7 @@
               <w:lang w:eastAsia="es-CO"/>
             </w:rPr>
           </w:pPr>
-          <w:hyperlink w:anchor="_Toc225966810" w:history="1">
+          <w:hyperlink w:anchor="_Toc227072239" w:history="1">
             <w:r>
               <w:rPr>
                 <w:rStyle w:val="Hipervnculo"/>
@@ -2348,7 +2348,7 @@
                 <w:noProof/>
                 <w:webHidden/>
               </w:rPr>
-              <w:instrText xml:space="preserve"> PAGEREF _Toc225966810 \h </w:instrText>
+              <w:instrText xml:space="preserve"> PAGEREF _Toc227072239 \h </w:instrText>
             </w:r>
             <w:r>
               <w:rPr>
@@ -2368,7 +2368,7 @@
                 <w:noProof/>
                 <w:webHidden/>
               </w:rPr>
-              <w:t>29</w:t>
+              <w:t>28</w:t>
             </w:r>
             <w:r>
               <w:rPr>
@@ -2413,7 +2413,7 @@
       <w:pPr>
         <w:pStyle w:val="Titulosgenerales"/>
       </w:pPr>
-      <w:bookmarkStart w:id="0" w:name="_Toc225966790"/>
+      <w:bookmarkStart w:id="0" w:name="_Toc227072219"/>
       <w:r>
         <w:lastRenderedPageBreak/>
         <w:t>Introducción</w:t>
@@ -2684,7 +2684,7 @@
       <w:pPr>
         <w:pStyle w:val="Ttulo1"/>
       </w:pPr>
-      <w:bookmarkStart w:id="1" w:name="_Toc225966791"/>
+      <w:bookmarkStart w:id="1" w:name="_Toc227072220"/>
       <w:r>
         <w:lastRenderedPageBreak/>
         <w:t>Analítica de datos para redes sociales</w:t>
@@ -2792,7 +2792,7 @@
       <w:pPr>
         <w:pStyle w:val="Ttulo2"/>
       </w:pPr>
-      <w:bookmarkStart w:id="2" w:name="_Toc225966792"/>
+      <w:bookmarkStart w:id="2" w:name="_Toc227072221"/>
       <w:r>
         <w:t>Componentes de la analítica digital</w:t>
       </w:r>
@@ -2948,7 +2948,7 @@
       <w:pPr>
         <w:pStyle w:val="Ttulo2"/>
       </w:pPr>
-      <w:bookmarkStart w:id="3" w:name="_Toc225966793"/>
+      <w:bookmarkStart w:id="3" w:name="_Toc227072222"/>
       <w:r>
         <w:t>Uso de los datos obtenidos</w:t>
       </w:r>
@@ -3129,6 +3129,8 @@
           <w:numId w:val="23"/>
         </w:numPr>
         <w:rPr>
+          <w:b/>
+          <w:bCs/>
           <w:lang w:val="es-419" w:eastAsia="es-CO"/>
         </w:rPr>
       </w:pPr>
@@ -3305,7 +3307,7 @@
       <w:pPr>
         <w:pStyle w:val="Ttulo1"/>
       </w:pPr>
-      <w:bookmarkStart w:id="4" w:name="_Toc225966794"/>
+      <w:bookmarkStart w:id="4" w:name="_Toc227072223"/>
       <w:r>
         <w:lastRenderedPageBreak/>
         <w:t>Contenidos, medición y análisis</w:t>
@@ -3379,7 +3381,7 @@
       <w:pPr>
         <w:pStyle w:val="Ttulo2"/>
       </w:pPr>
-      <w:bookmarkStart w:id="5" w:name="_Toc225966795"/>
+      <w:bookmarkStart w:id="5" w:name="_Toc227072224"/>
       <w:r>
         <w:t>¿Qué se debe medir?</w:t>
       </w:r>
@@ -3496,7 +3498,7 @@
       <w:pPr>
         <w:pStyle w:val="Ttulo2"/>
       </w:pPr>
-      <w:bookmarkStart w:id="6" w:name="_Toc225966796"/>
+      <w:bookmarkStart w:id="6" w:name="_Toc227072225"/>
       <w:r>
         <w:t>Definición de objetivos</w:t>
       </w:r>
@@ -3922,9 +3924,12 @@
       <w:pPr>
         <w:pStyle w:val="Ttulo2"/>
       </w:pPr>
-      <w:bookmarkStart w:id="7" w:name="_Toc225966797"/>
-      <w:r>
-        <w:t>KPI (</w:t>
+      <w:bookmarkStart w:id="7" w:name="_Toc227072226"/>
+      <w:r>
+        <w:t>KPI</w:t>
+      </w:r>
+      <w:r>
+        <w:t xml:space="preserve"> (</w:t>
       </w:r>
       <w:r>
         <w:rPr>
@@ -3953,7 +3958,16 @@
         <w:rPr>
           <w:lang w:val="es-419" w:eastAsia="es-CO"/>
         </w:rPr>
-        <w:t>Desempeño o KPI (</w:t>
+        <w:t xml:space="preserve">Desempeño o </w:t>
+      </w:r>
+      <w:r>
+        <w:t>KPI</w:t>
+      </w:r>
+      <w:r>
+        <w:rPr>
+          <w:lang w:val="es-419" w:eastAsia="es-CO"/>
+        </w:rPr>
+        <w:t xml:space="preserve"> (</w:t>
       </w:r>
       <w:r>
         <w:rPr>
@@ -3981,7 +3995,34 @@
         <w:rPr>
           <w:lang w:val="es-419" w:eastAsia="es-CO"/>
         </w:rPr>
-        <w:t xml:space="preserve"> con lo que cada objetivo y estrategia lleva consigo un KPI diferente. Para ello, es indispensable conocer los tipos de KPI existentes para determinar cuáles servirán en el proceso, entendiendo que un KPI se determina como una meta a alcanzar para identificar si las estrategias realizadas funcionan o no.</w:t>
+        <w:t xml:space="preserve"> con lo que cada objetivo y estrategia lleva consigo un </w:t>
+      </w:r>
+      <w:r>
+        <w:t>KPI</w:t>
+      </w:r>
+      <w:r>
+        <w:rPr>
+          <w:lang w:val="es-419" w:eastAsia="es-CO"/>
+        </w:rPr>
+        <w:t xml:space="preserve"> diferente. Para ello, es indispensable conocer los tipos de </w:t>
+      </w:r>
+      <w:r>
+        <w:t>KPI</w:t>
+      </w:r>
+      <w:r>
+        <w:rPr>
+          <w:lang w:val="es-419" w:eastAsia="es-CO"/>
+        </w:rPr>
+        <w:t xml:space="preserve"> existentes para determinar cuáles servirán en el proceso, entendiendo que un </w:t>
+      </w:r>
+      <w:r>
+        <w:t>KPI</w:t>
+      </w:r>
+      <w:r>
+        <w:rPr>
+          <w:lang w:val="es-419" w:eastAsia="es-CO"/>
+        </w:rPr>
+        <w:t xml:space="preserve"> se determina como una meta a alcanzar para identificar si las estrategias realizadas funcionan o no.</w:t>
       </w:r>
     </w:p>
     <w:p>
@@ -4012,7 +4053,14 @@
           <w:bCs/>
           <w:lang w:val="es-419" w:eastAsia="es-CO"/>
         </w:rPr>
-        <w:t>Tipos de KPI</w:t>
+        <w:t xml:space="preserve">Tipos de </w:t>
+      </w:r>
+      <w:r>
+        <w:rPr>
+          <w:b/>
+          <w:bCs/>
+        </w:rPr>
+        <w:t>KPI</w:t>
       </w:r>
     </w:p>
     <w:p>
@@ -4044,7 +4092,16 @@
         <w:rPr>
           <w:lang w:val="es-419" w:eastAsia="es-CO"/>
         </w:rPr>
-        <w:t xml:space="preserve"> digital Juan Carlos Mejía Llano (2020) existen tres categorías de KPI que se aplican para redes sociales o sitio web ¿cuáles son?; para que pueda explicarlas y probarlas en su contexto, continua con la lectura.</w:t>
+        <w:t xml:space="preserve"> digital Juan Carlos Mejía Llano (2020) existen tres categorías de </w:t>
+      </w:r>
+      <w:r>
+        <w:t>KPI</w:t>
+      </w:r>
+      <w:r>
+        <w:rPr>
+          <w:lang w:val="es-419" w:eastAsia="es-CO"/>
+        </w:rPr>
+        <w:t xml:space="preserve"> que se aplican para redes sociales o sitio web ¿cuáles son?; para que pueda explicarlas y probarlas en su contexto, continua con la lectura.</w:t>
       </w:r>
     </w:p>
     <w:p>
@@ -4064,9 +4121,16 @@
         <w:rPr>
           <w:b/>
           <w:bCs/>
-          <w:lang w:val="es-419" w:eastAsia="es-CO"/>
-        </w:rPr>
-        <w:t>KPI de gestión y comunidad</w:t>
+        </w:rPr>
+        <w:t>KPI</w:t>
+      </w:r>
+      <w:r>
+        <w:rPr>
+          <w:b/>
+          <w:bCs/>
+          <w:lang w:val="es-419" w:eastAsia="es-CO"/>
+        </w:rPr>
+        <w:t xml:space="preserve"> de gestión y comunidad</w:t>
       </w:r>
     </w:p>
     <w:p>
@@ -4096,20 +4160,47 @@
           <w:bCs/>
           <w:lang w:val="es-419" w:eastAsia="es-CO"/>
         </w:rPr>
-        <w:t>¿Qué tipo de indicadores tiene cada categoría KPI?</w:t>
-      </w:r>
-    </w:p>
-    <w:p>
-      <w:pPr>
-        <w:rPr>
-          <w:lang w:val="es-419" w:eastAsia="es-CO"/>
-        </w:rPr>
-      </w:pPr>
-      <w:r>
-        <w:rPr>
-          <w:lang w:val="es-419" w:eastAsia="es-CO"/>
-        </w:rPr>
-        <w:t>La categoría KPI de gestión y comunidad está conformada por dos indicadores principales, los cuales permiten evaluar el desempeño de la gestión realizada y el nivel de interacción, participación y crecimiento de la comunidad. Estos indicadores facilitan el seguimiento de las acciones implementadas, así como la medición del impacto generado en los usuarios o audiencia objetivo.</w:t>
+        <w:t xml:space="preserve">¿Qué tipo de indicadores tiene cada categoría </w:t>
+      </w:r>
+      <w:r>
+        <w:rPr>
+          <w:b/>
+          <w:bCs/>
+        </w:rPr>
+        <w:t>KPI</w:t>
+      </w:r>
+      <w:r>
+        <w:rPr>
+          <w:b/>
+          <w:bCs/>
+          <w:lang w:val="es-419" w:eastAsia="es-CO"/>
+        </w:rPr>
+        <w:t>?</w:t>
+      </w:r>
+    </w:p>
+    <w:p>
+      <w:pPr>
+        <w:rPr>
+          <w:lang w:val="es-419" w:eastAsia="es-CO"/>
+        </w:rPr>
+      </w:pPr>
+      <w:r>
+        <w:rPr>
+          <w:lang w:val="es-419" w:eastAsia="es-CO"/>
+        </w:rPr>
+        <w:t xml:space="preserve">La categoría </w:t>
+      </w:r>
+      <w:r>
+        <w:rPr>
+          <w:lang w:val="es-419" w:eastAsia="es-CO"/>
+        </w:rPr>
+        <w:t>KPI</w:t>
+      </w:r>
+      <w:r>
+        <w:rPr>
+          <w:lang w:val="es-419" w:eastAsia="es-CO"/>
+        </w:rPr>
+        <w:t xml:space="preserve"> de gestión y comunidad está conformada por dos indicadores principales, los cuales permiten evaluar el desempeño de la gestión realizada y el nivel de interacción, participación y crecimiento de la comunidad. Estos indicadores facilitan el seguimiento de las acciones implementadas, así como la medición del impacto generado en los usuarios o audiencia objetivo.</w:t>
       </w:r>
     </w:p>
     <w:p>
@@ -4186,10 +4277,17 @@
         <w:rPr>
           <w:b/>
           <w:bCs/>
-          <w:lang w:val="es-419" w:eastAsia="es-CO"/>
         </w:rPr>
         <w:lastRenderedPageBreak/>
-        <w:t>KPI de interacción y alcance</w:t>
+        <w:t>KPI</w:t>
+      </w:r>
+      <w:r>
+        <w:rPr>
+          <w:b/>
+          <w:bCs/>
+          <w:lang w:val="es-419" w:eastAsia="es-CO"/>
+        </w:rPr>
+        <w:t xml:space="preserve"> de interacción y alcance</w:t>
       </w:r>
     </w:p>
     <w:p>
@@ -4389,16 +4487,25 @@
           <w:numId w:val="26"/>
         </w:numPr>
         <w:rPr>
-          <w:lang w:val="es-419" w:eastAsia="es-CO"/>
-        </w:rPr>
-      </w:pPr>
-      <w:r>
-        <w:rPr>
           <w:b/>
           <w:bCs/>
           <w:lang w:val="es-419" w:eastAsia="es-CO"/>
         </w:rPr>
-        <w:t>KPI de conversión y resultado</w:t>
+      </w:pPr>
+      <w:r>
+        <w:rPr>
+          <w:b/>
+          <w:bCs/>
+        </w:rPr>
+        <w:t>KPI</w:t>
+      </w:r>
+      <w:r>
+        <w:rPr>
+          <w:b/>
+          <w:bCs/>
+          <w:lang w:val="es-419" w:eastAsia="es-CO"/>
+        </w:rPr>
+        <w:t xml:space="preserve"> de conversión y resultado</w:t>
       </w:r>
     </w:p>
     <w:p>
@@ -4794,7 +4901,7 @@
       <w:pPr>
         <w:pStyle w:val="Ttulo2"/>
       </w:pPr>
-      <w:bookmarkStart w:id="8" w:name="_Toc225966798"/>
+      <w:bookmarkStart w:id="8" w:name="_Toc227072227"/>
       <w:r>
         <w:t>Proceso de medición</w:t>
       </w:r>
@@ -4865,7 +4972,16 @@
         <w:rPr>
           <w:lang w:val="es-419" w:eastAsia="es-CO"/>
         </w:rPr>
-        <w:t xml:space="preserve"> establecido. En este punto hay que tener en cuenta los objetivos de la marca o empresa, los KPI a utilizar, las estrategias y herramientas que se van a llevar a cabo para conseguir dichos objetivos, la segmentación del público, entre otros.</w:t>
+        <w:t xml:space="preserve"> establecido. En este punto hay que tener en cuenta los objetivos de la marca o empresa, los </w:t>
+      </w:r>
+      <w:r>
+        <w:t>KPI</w:t>
+      </w:r>
+      <w:r>
+        <w:rPr>
+          <w:lang w:val="es-419" w:eastAsia="es-CO"/>
+        </w:rPr>
+        <w:t xml:space="preserve"> a utilizar, las estrategias y herramientas que se van a llevar a cabo para conseguir dichos objetivos, la segmentación del público, entre otros.</w:t>
       </w:r>
     </w:p>
     <w:p>
@@ -5035,7 +5151,7 @@
       <w:pPr>
         <w:pStyle w:val="Ttulo1"/>
       </w:pPr>
-      <w:bookmarkStart w:id="9" w:name="_Toc225966799"/>
+      <w:bookmarkStart w:id="9" w:name="_Toc227072228"/>
       <w:r>
         <w:lastRenderedPageBreak/>
         <w:t>Análisis de información</w:t>
@@ -5268,7 +5384,7 @@
       <w:pPr>
         <w:pStyle w:val="Ttulo2"/>
       </w:pPr>
-      <w:bookmarkStart w:id="10" w:name="_Toc225966800"/>
+      <w:bookmarkStart w:id="10" w:name="_Toc227072229"/>
       <w:r>
         <w:t>¿Qué se debe medir?</w:t>
       </w:r>
@@ -5284,7 +5400,16 @@
         <w:rPr>
           <w:lang w:val="es-419" w:eastAsia="es-CO"/>
         </w:rPr>
-        <w:t>Haciendo énfasis en la importancia de poner en contexto los datos encontrados y para realizar un mejor análisis de la información obtenida, se necesita entender el mercado en el que se desenvuelve el negocio, segmentar el público y poner especial cuidado en los KPI utilizados según los objetivos establecidos, puesto que en un mar de datos es posible perder el norte, si no se ha definido qué se desea y se debe analizar.</w:t>
+        <w:t xml:space="preserve">Haciendo énfasis en la importancia de poner en contexto los datos encontrados y para realizar un mejor análisis de la información obtenida, se necesita entender el mercado en el que se desenvuelve el negocio, segmentar el público y poner especial cuidado en los </w:t>
+      </w:r>
+      <w:r>
+        <w:t>KPI</w:t>
+      </w:r>
+      <w:r>
+        <w:rPr>
+          <w:lang w:val="es-419" w:eastAsia="es-CO"/>
+        </w:rPr>
+        <w:t xml:space="preserve"> utilizados según los objetivos establecidos, puesto que en un mar de datos es posible perder el norte, si no se ha definido qué se desea y se debe analizar.</w:t>
       </w:r>
     </w:p>
     <w:p>
@@ -5393,7 +5518,7 @@
       <w:pPr>
         <w:pStyle w:val="Ttulo2"/>
       </w:pPr>
-      <w:bookmarkStart w:id="11" w:name="_Toc225966801"/>
+      <w:bookmarkStart w:id="11" w:name="_Toc227072230"/>
       <w:r>
         <w:t>Análisi</w:t>
       </w:r>
@@ -5468,7 +5593,7 @@
       <w:pPr>
         <w:pStyle w:val="Ttulo2"/>
       </w:pPr>
-      <w:bookmarkStart w:id="12" w:name="_Toc225966802"/>
+      <w:bookmarkStart w:id="12" w:name="_Toc227072231"/>
       <w:r>
         <w:t>Análisis cualitativo</w:t>
       </w:r>
@@ -5640,7 +5765,7 @@
       <w:pPr>
         <w:pStyle w:val="Ttulo2"/>
       </w:pPr>
-      <w:bookmarkStart w:id="13" w:name="_Toc225966803"/>
+      <w:bookmarkStart w:id="13" w:name="_Toc227072232"/>
       <w:r>
         <w:t>Comportamiento del consumidor (personalidades de compra)</w:t>
       </w:r>
@@ -5879,7 +6004,7 @@
       <w:pPr>
         <w:pStyle w:val="Ttulo1"/>
       </w:pPr>
-      <w:bookmarkStart w:id="14" w:name="_Toc225966804"/>
+      <w:bookmarkStart w:id="14" w:name="_Toc227072233"/>
       <w:r>
         <w:lastRenderedPageBreak/>
         <w:t>Estructuración e interpretación de indicadores para la preparación de reportes</w:t>
@@ -5916,7 +6041,7 @@
       <w:pPr>
         <w:pStyle w:val="Ttulo2"/>
       </w:pPr>
-      <w:bookmarkStart w:id="15" w:name="_Toc225966805"/>
+      <w:bookmarkStart w:id="15" w:name="_Toc227072234"/>
       <w:r>
         <w:t>Características de un reporte de resultados</w:t>
       </w:r>
@@ -5932,7 +6057,16 @@
         <w:rPr>
           <w:lang w:val="es-419" w:eastAsia="es-CO"/>
         </w:rPr>
-        <w:t>Un informe de resultados basa sus características de acuerdo con la persona que será presentada como también definirá los KPI, objetivos, formatos, etc. Es importante saber a quién se dirige para exponer de la manera más clara la información encontrada y permitir una toma de decisiones certera.</w:t>
+        <w:t xml:space="preserve">Un informe de resultados basa sus características de acuerdo con la persona que será presentada como también definirá los </w:t>
+      </w:r>
+      <w:r>
+        <w:t>KPI</w:t>
+      </w:r>
+      <w:r>
+        <w:rPr>
+          <w:lang w:val="es-419" w:eastAsia="es-CO"/>
+        </w:rPr>
+        <w:t>, objetivos, formatos, etc. Es importante saber a quién se dirige para exponer de la manera más clara la información encontrada y permitir una toma de decisiones certera.</w:t>
       </w:r>
       <w:r>
         <w:rPr>
@@ -6043,7 +6177,7 @@
       <w:pPr>
         <w:pStyle w:val="Ttulo2"/>
       </w:pPr>
-      <w:bookmarkStart w:id="16" w:name="_Toc225966806"/>
+      <w:bookmarkStart w:id="16" w:name="_Toc227072235"/>
       <w:r>
         <w:t>Tipos de reportes</w:t>
       </w:r>
@@ -6089,7 +6223,16 @@
         <w:rPr>
           <w:lang w:val="es-419" w:eastAsia="es-CO"/>
         </w:rPr>
-        <w:t>Elementos de vital importancia donde se pueden agrupar los KPI necesarios dentro de un mismo contexto para identificar a simple vista si la marca o empresa va por buen o mal camino. En este se debe hacer uso de los gráficos necesarios para que visualmente cause la atención que se desea; la información para estos recursos se puede extraer de las fuentes de tráfico, objetivos y conclusiones.</w:t>
+        <w:t xml:space="preserve">Elementos de vital importancia donde se pueden agrupar los </w:t>
+      </w:r>
+      <w:r>
+        <w:t>KPI</w:t>
+      </w:r>
+      <w:r>
+        <w:rPr>
+          <w:lang w:val="es-419" w:eastAsia="es-CO"/>
+        </w:rPr>
+        <w:t xml:space="preserve"> necesarios dentro de un mismo contexto para identificar a simple vista si la marca o empresa va por buen o mal camino. En este se debe hacer uso de los gráficos necesarios para que visualmente cause la atención que se desea; la información para estos recursos se puede extraer de las fuentes de tráfico, objetivos y conclusiones.</w:t>
       </w:r>
     </w:p>
     <w:p>
@@ -6217,7 +6360,7 @@
       <w:pPr>
         <w:pStyle w:val="Titulosgenerales"/>
       </w:pPr>
-      <w:bookmarkStart w:id="17" w:name="_Toc225966807"/>
+      <w:bookmarkStart w:id="17" w:name="_Toc227072236"/>
       <w:r>
         <w:lastRenderedPageBreak/>
         <w:t>S</w:t>
@@ -6294,7 +6437,16 @@
         <w:rPr>
           <w:lang w:val="es-419" w:eastAsia="es-CO"/>
         </w:rPr>
-        <w:t xml:space="preserve">El componente también desarrolla los procesos de medición y análisis aplicados a los contenidos en redes sociales, abordando la definición de objetivos y el uso de indicadores clave de desempeño. Se presentan distintos tipos de KPI relacionados con gestión, interacción, alcance y conversión, tales como </w:t>
+        <w:t xml:space="preserve">El componente también desarrolla los procesos de medición y análisis aplicados a los contenidos en redes sociales, abordando la definición de objetivos y el uso de indicadores clave de desempeño. Se presentan distintos tipos de </w:t>
+      </w:r>
+      <w:r>
+        <w:t>KPI</w:t>
+      </w:r>
+      <w:r>
+        <w:rPr>
+          <w:lang w:val="es-419" w:eastAsia="es-CO"/>
+        </w:rPr>
+        <w:t xml:space="preserve"> relacionados con gestión, interacción, alcance y conversión, tales como </w:t>
       </w:r>
       <w:proofErr w:type="spellStart"/>
       <w:r>
@@ -6327,6 +6479,7 @@
     </w:p>
     <w:p>
       <w:pPr>
+        <w:jc w:val="center"/>
         <w:rPr>
           <w:lang w:val="es-419" w:eastAsia="es-CO"/>
         </w:rPr>
@@ -6336,12 +6489,11 @@
           <w:noProof/>
           <w:lang w:val="es-419" w:eastAsia="es-CO"/>
         </w:rPr>
-        <w:lastRenderedPageBreak/>
         <w:drawing>
-          <wp:inline distT="0" distB="0" distL="0" distR="0" wp14:anchorId="3C3038F0" wp14:editId="4459EA9D">
-            <wp:extent cx="5875819" cy="4096987"/>
-            <wp:effectExtent l="0" t="0" r="0" b="0"/>
-            <wp:docPr id="649351392" name="Imagen 5" descr="pendiente texto"/>
+          <wp:inline distT="0" distB="0" distL="0" distR="0" wp14:anchorId="079C7D03" wp14:editId="247A5AF9">
+            <wp:extent cx="5807967" cy="2265348"/>
+            <wp:effectExtent l="0" t="0" r="2540" b="1905"/>
+            <wp:docPr id="6927999" name="Imagen 5" descr="La imagen muestra un mapa conceptual sobre la analítica digital para redes sociales, organizado en cuatro áreas principales: analítica de datos, contenidos y medición, análisis de información y estructuración de indicadores para reportes. En conjunto, estos elementos explican cómo medir, analizar e interpretar datos, incluyendo objetivos, KPI, competencia y comportamiento del consumidor para evaluar el desempeño y apoyar la toma de decisiones estratégicas."/>
             <wp:cNvGraphicFramePr>
               <a:graphicFrameLocks xmlns:a="http://schemas.openxmlformats.org/drawingml/2006/main" noChangeAspect="1"/>
             </wp:cNvGraphicFramePr>
@@ -6349,7 +6501,7 @@
               <a:graphicData uri="http://schemas.openxmlformats.org/drawingml/2006/picture">
                 <pic:pic xmlns:pic="http://schemas.openxmlformats.org/drawingml/2006/picture">
                   <pic:nvPicPr>
-                    <pic:cNvPr id="649351392" name="Imagen 5" descr="pendiente texto"/>
+                    <pic:cNvPr id="6927999" name="Imagen 5" descr="La imagen muestra un mapa conceptual sobre la analítica digital para redes sociales, organizado en cuatro áreas principales: analítica de datos, contenidos y medición, análisis de información y estructuración de indicadores para reportes. En conjunto, estos elementos explican cómo medir, analizar e interpretar datos, incluyendo objetivos, KPI, competencia y comportamiento del consumidor para evaluar el desempeño y apoyar la toma de decisiones estratégicas."/>
                     <pic:cNvPicPr>
                       <a:picLocks noChangeAspect="1" noChangeArrowheads="1"/>
                     </pic:cNvPicPr>
@@ -6370,7 +6522,7 @@
                   <pic:spPr bwMode="auto">
                     <a:xfrm>
                       <a:off x="0" y="0"/>
-                      <a:ext cx="5902218" cy="4115394"/>
+                      <a:ext cx="5838491" cy="2277254"/>
                     </a:xfrm>
                     <a:prstGeom prst="rect">
                       <a:avLst/>
@@ -6396,7 +6548,7 @@
       <w:pPr>
         <w:pStyle w:val="Titulosgenerales"/>
       </w:pPr>
-      <w:bookmarkStart w:id="18" w:name="_Toc225966808"/>
+      <w:bookmarkStart w:id="18" w:name="_Toc227072237"/>
       <w:r>
         <w:lastRenderedPageBreak/>
         <w:t>Glosario</w:t>
@@ -6476,13 +6628,20 @@
       </w:pPr>
       <w:r>
         <w:rPr>
+          <w:b/>
+          <w:bCs/>
+        </w:rPr>
+        <w:t>KPI</w:t>
+      </w:r>
+      <w:r>
+        <w:rPr>
           <w:rFonts w:ascii="Calibri" w:hAnsi="Calibri" w:cs="Calibri"/>
           <w:b/>
           <w:bCs/>
           <w:szCs w:val="28"/>
           <w:lang w:val="es-419"/>
         </w:rPr>
-        <w:t>KPI (</w:t>
+        <w:t xml:space="preserve"> (</w:t>
       </w:r>
       <w:r>
         <w:rPr>
@@ -6673,1028 +6832,438 @@
       <w:pPr>
         <w:pStyle w:val="Titulosgenerales"/>
       </w:pPr>
-      <w:bookmarkStart w:id="19" w:name="_Toc225966810"/>
-      <w:bookmarkStart w:id="20" w:name="_Toc216687354"/>
+      <w:bookmarkStart w:id="19" w:name="_Toc216687354"/>
+      <w:bookmarkStart w:id="20" w:name="_Toc227072238"/>
       <w:r>
         <w:lastRenderedPageBreak/>
         <w:t>Referencias bibliográficas</w:t>
       </w:r>
+      <w:bookmarkEnd w:id="19"/>
       <w:bookmarkEnd w:id="20"/>
       <w:r>
         <w:t xml:space="preserve"> </w:t>
       </w:r>
     </w:p>
     <w:p>
-      <w:pPr>
-        <w:pStyle w:val="Normal0"/>
-        <w:ind w:firstLine="708"/>
-        <w:rPr>
-          <w:rFonts w:asciiTheme="minorHAnsi" w:hAnsiTheme="minorHAnsi" w:cstheme="minorHAnsi"/>
-          <w:sz w:val="28"/>
-          <w:szCs w:val="28"/>
-        </w:rPr>
-      </w:pPr>
-      <w:r>
-        <w:rPr>
-          <w:rFonts w:asciiTheme="minorHAnsi" w:hAnsiTheme="minorHAnsi" w:cstheme="minorHAnsi"/>
-          <w:sz w:val="28"/>
-          <w:szCs w:val="28"/>
-        </w:rPr>
-        <w:t>Cibrián, I. B. (2019). Marketing digital. Mide, analiza y mejora. ESIC.</w:t>
-      </w:r>
-    </w:p>
-    <w:p>
-      <w:pPr>
-        <w:pStyle w:val="Normal0"/>
-        <w:ind w:firstLine="708"/>
-        <w:rPr>
-          <w:rFonts w:asciiTheme="minorHAnsi" w:hAnsiTheme="minorHAnsi" w:cstheme="minorHAnsi"/>
-          <w:sz w:val="28"/>
-          <w:szCs w:val="28"/>
-        </w:rPr>
-      </w:pPr>
-    </w:p>
-    <w:p>
-      <w:pPr>
-        <w:pStyle w:val="Normal0"/>
-        <w:ind w:firstLine="708"/>
-        <w:rPr>
-          <w:rFonts w:asciiTheme="minorHAnsi" w:hAnsiTheme="minorHAnsi" w:cstheme="minorHAnsi"/>
-          <w:sz w:val="28"/>
-          <w:szCs w:val="28"/>
-        </w:rPr>
-      </w:pPr>
-      <w:r>
-        <w:rPr>
-          <w:rFonts w:asciiTheme="minorHAnsi" w:hAnsiTheme="minorHAnsi" w:cstheme="minorHAnsi"/>
-          <w:sz w:val="28"/>
-          <w:szCs w:val="28"/>
-        </w:rPr>
+      <w:r>
+        <w:t xml:space="preserve">Cibrián, I. B. (2019). </w:t>
+      </w:r>
+      <w:r>
+        <w:rPr>
+          <w:rStyle w:val="Extranjerismo"/>
+        </w:rPr>
+        <w:t>Marketing</w:t>
+      </w:r>
+      <w:r>
+        <w:t xml:space="preserve"> digital. Mide, analiza y mejora. ESIC.</w:t>
+      </w:r>
+    </w:p>
+    <w:p>
+      <w:r>
         <w:t>DANE. (s.f.). Guía para diseño, construcción e interpretación de indicadores. DANE.</w:t>
       </w:r>
     </w:p>
     <w:p>
-      <w:pPr>
-        <w:pStyle w:val="Normal0"/>
-        <w:ind w:firstLine="708"/>
-        <w:rPr>
-          <w:rFonts w:asciiTheme="minorHAnsi" w:hAnsiTheme="minorHAnsi" w:cstheme="minorHAnsi"/>
-          <w:sz w:val="28"/>
-          <w:szCs w:val="28"/>
-        </w:rPr>
-      </w:pPr>
-    </w:p>
-    <w:p>
-      <w:pPr>
-        <w:pStyle w:val="Normal0"/>
-        <w:ind w:firstLine="708"/>
-        <w:rPr>
-          <w:rFonts w:asciiTheme="minorHAnsi" w:hAnsiTheme="minorHAnsi" w:cstheme="minorHAnsi"/>
-          <w:sz w:val="28"/>
-          <w:szCs w:val="28"/>
-        </w:rPr>
-      </w:pPr>
-      <w:r>
-        <w:rPr>
-          <w:rFonts w:asciiTheme="minorHAnsi" w:hAnsiTheme="minorHAnsi" w:cstheme="minorHAnsi"/>
-          <w:sz w:val="28"/>
-          <w:szCs w:val="28"/>
-        </w:rPr>
+      <w:r>
         <w:t>Galiana, P. (2018). Qué es la analítica web, para qué sirve y principales herramientas.</w:t>
       </w:r>
       <w:r>
-        <w:rPr>
-          <w:rFonts w:asciiTheme="minorHAnsi" w:hAnsiTheme="minorHAnsi" w:cstheme="minorHAnsi"/>
-          <w:sz w:val="28"/>
-          <w:szCs w:val="28"/>
-        </w:rPr>
         <w:t xml:space="preserve"> </w:t>
       </w:r>
       <w:hyperlink r:id="rId16" w:history="1">
         <w:r>
           <w:rPr>
             <w:rStyle w:val="Hipervnculo"/>
-            <w:rFonts w:asciiTheme="minorHAnsi" w:hAnsiTheme="minorHAnsi" w:cstheme="minorHAnsi"/>
-            <w:sz w:val="28"/>
+            <w:rFonts w:cstheme="minorHAnsi"/>
             <w:szCs w:val="28"/>
           </w:rPr>
           <w:t>https://www.iebschool.com/blog/herramientas-analisis-web-analitica-usabilidad/</w:t>
         </w:r>
       </w:hyperlink>
       <w:r>
-        <w:rPr>
-          <w:rFonts w:asciiTheme="minorHAnsi" w:hAnsiTheme="minorHAnsi" w:cstheme="minorHAnsi"/>
-          <w:sz w:val="28"/>
-          <w:szCs w:val="28"/>
-        </w:rPr>
         <w:t xml:space="preserve"> </w:t>
       </w:r>
     </w:p>
     <w:p>
-      <w:pPr>
-        <w:pStyle w:val="Normal0"/>
-        <w:ind w:firstLine="708"/>
-        <w:rPr>
-          <w:rFonts w:asciiTheme="minorHAnsi" w:hAnsiTheme="minorHAnsi" w:cstheme="minorHAnsi"/>
-          <w:sz w:val="28"/>
-          <w:szCs w:val="28"/>
-        </w:rPr>
-      </w:pPr>
-    </w:p>
-    <w:p>
-      <w:pPr>
-        <w:pStyle w:val="Normal0"/>
-        <w:ind w:firstLine="708"/>
-        <w:rPr>
-          <w:rFonts w:asciiTheme="minorHAnsi" w:hAnsiTheme="minorHAnsi" w:cstheme="minorHAnsi"/>
-          <w:sz w:val="28"/>
-          <w:szCs w:val="28"/>
-        </w:rPr>
-      </w:pPr>
-      <w:r>
-        <w:rPr>
-          <w:rFonts w:asciiTheme="minorHAnsi" w:hAnsiTheme="minorHAnsi" w:cstheme="minorHAnsi"/>
-          <w:sz w:val="28"/>
-          <w:szCs w:val="28"/>
-        </w:rPr>
-        <w:t>Gómez, S. e Instituto de Marketing Ágil. (22 de noviembre de 2017). Qué es la analítica web y para qué sirve. [Video]. YouTube.</w:t>
-      </w:r>
-      <w:r>
-        <w:rPr>
-          <w:rFonts w:asciiTheme="minorHAnsi" w:hAnsiTheme="minorHAnsi" w:cstheme="minorHAnsi"/>
-          <w:sz w:val="28"/>
-          <w:szCs w:val="28"/>
-        </w:rPr>
+      <w:r>
+        <w:t xml:space="preserve">Gómez, S. e Instituto de </w:t>
+      </w:r>
+      <w:r>
+        <w:rPr>
+          <w:rStyle w:val="Extranjerismo"/>
+        </w:rPr>
+        <w:t>Marketing</w:t>
+      </w:r>
+      <w:r>
+        <w:t xml:space="preserve"> Ágil. (22 de noviembre de 2017). Qué es la analítica web y para qué sirve. [Video]. YouTube.</w:t>
+      </w:r>
+      <w:r>
         <w:t xml:space="preserve"> </w:t>
       </w:r>
       <w:hyperlink r:id="rId17" w:history="1">
         <w:r>
           <w:rPr>
             <w:rStyle w:val="Hipervnculo"/>
-            <w:rFonts w:asciiTheme="minorHAnsi" w:hAnsiTheme="minorHAnsi" w:cstheme="minorHAnsi"/>
-            <w:sz w:val="28"/>
+            <w:rFonts w:cstheme="minorHAnsi"/>
             <w:szCs w:val="28"/>
           </w:rPr>
           <w:t>https://www.youtube.com/watch?v=W1q_SyJPfdg&amp;ab_channel=InstitutodeMarketingAgil</w:t>
         </w:r>
       </w:hyperlink>
       <w:r>
-        <w:rPr>
-          <w:rFonts w:asciiTheme="minorHAnsi" w:hAnsiTheme="minorHAnsi" w:cstheme="minorHAnsi"/>
-          <w:sz w:val="28"/>
-          <w:szCs w:val="28"/>
-        </w:rPr>
         <w:t xml:space="preserve"> </w:t>
       </w:r>
     </w:p>
     <w:p>
-      <w:pPr>
-        <w:pStyle w:val="Normal0"/>
-        <w:ind w:firstLine="708"/>
-        <w:rPr>
-          <w:rFonts w:asciiTheme="minorHAnsi" w:hAnsiTheme="minorHAnsi" w:cstheme="minorHAnsi"/>
-          <w:sz w:val="28"/>
-          <w:szCs w:val="28"/>
-        </w:rPr>
-      </w:pPr>
       <w:proofErr w:type="spellStart"/>
       <w:r>
-        <w:rPr>
-          <w:rFonts w:asciiTheme="minorHAnsi" w:hAnsiTheme="minorHAnsi" w:cstheme="minorHAnsi"/>
-          <w:sz w:val="28"/>
-          <w:szCs w:val="28"/>
-        </w:rPr>
         <w:t>GraciAds</w:t>
       </w:r>
       <w:proofErr w:type="spellEnd"/>
       <w:r>
-        <w:rPr>
-          <w:rFonts w:asciiTheme="minorHAnsi" w:hAnsiTheme="minorHAnsi" w:cstheme="minorHAnsi"/>
-          <w:sz w:val="28"/>
-          <w:szCs w:val="28"/>
-        </w:rPr>
         <w:t>. (2021). El comportamiento del consumidor en las redes sociales.</w:t>
       </w:r>
       <w:r>
-        <w:rPr>
-          <w:rFonts w:asciiTheme="minorHAnsi" w:hAnsiTheme="minorHAnsi" w:cstheme="minorHAnsi"/>
-          <w:sz w:val="28"/>
-          <w:szCs w:val="28"/>
-        </w:rPr>
         <w:t xml:space="preserve"> </w:t>
       </w:r>
-      <w:hyperlink r:id="rId18" w:history="1">
+      <w:hyperlink r:id="rId18" w:anchor=":~:text=Por%20lo%20general%2C%20los%20estudios,de%20marca%20como%20un%20bot" w:history="1">
         <w:r>
           <w:rPr>
             <w:rStyle w:val="Hipervnculo"/>
-            <w:rFonts w:asciiTheme="minorHAnsi" w:hAnsiTheme="minorHAnsi" w:cstheme="minorHAnsi"/>
-            <w:sz w:val="28"/>
+            <w:rFonts w:cstheme="minorHAnsi"/>
             <w:szCs w:val="28"/>
           </w:rPr>
           <w:t>https://graciads.com/comportamiento-del-consumidor-en-redes-sociales/#:~:text=Por%20lo%20general%2C%20los%20estudios,de%20marca%20como%20un%20bot</w:t>
         </w:r>
       </w:hyperlink>
       <w:r>
-        <w:rPr>
-          <w:rFonts w:asciiTheme="minorHAnsi" w:hAnsiTheme="minorHAnsi" w:cstheme="minorHAnsi"/>
-          <w:sz w:val="28"/>
-          <w:szCs w:val="28"/>
-        </w:rPr>
         <w:t xml:space="preserve"> </w:t>
       </w:r>
     </w:p>
     <w:p>
-      <w:pPr>
-        <w:pStyle w:val="Normal0"/>
-        <w:ind w:firstLine="708"/>
-        <w:rPr>
-          <w:rFonts w:asciiTheme="minorHAnsi" w:hAnsiTheme="minorHAnsi" w:cstheme="minorHAnsi"/>
-          <w:sz w:val="28"/>
-          <w:szCs w:val="28"/>
-        </w:rPr>
-      </w:pPr>
-    </w:p>
-    <w:p>
-      <w:pPr>
-        <w:pStyle w:val="Normal0"/>
-        <w:ind w:firstLine="708"/>
-        <w:rPr>
-          <w:rFonts w:asciiTheme="minorHAnsi" w:hAnsiTheme="minorHAnsi" w:cstheme="minorHAnsi"/>
-          <w:sz w:val="28"/>
-          <w:szCs w:val="28"/>
-        </w:rPr>
-      </w:pPr>
-      <w:r>
-        <w:rPr>
-          <w:rFonts w:asciiTheme="minorHAnsi" w:hAnsiTheme="minorHAnsi" w:cstheme="minorHAnsi"/>
-          <w:sz w:val="28"/>
-          <w:szCs w:val="28"/>
-        </w:rPr>
-        <w:t>IEBS Business School. (11 de septiembre de 2018). Cómo definir e interpretar métricas y KPI en analítica web de IEBS. [</w:t>
+      <w:r>
+        <w:t xml:space="preserve">IEBS Business School. (11 de septiembre de 2018). Cómo definir e interpretar métricas y </w:t>
+      </w:r>
+      <w:r>
+        <w:t>KPI</w:t>
+      </w:r>
+      <w:r>
+        <w:t xml:space="preserve"> en analítica web de IEBS. [</w:t>
       </w:r>
       <w:proofErr w:type="spellStart"/>
       <w:r>
-        <w:rPr>
-          <w:rFonts w:asciiTheme="minorHAnsi" w:hAnsiTheme="minorHAnsi" w:cstheme="minorHAnsi"/>
-          <w:sz w:val="28"/>
-          <w:szCs w:val="28"/>
-        </w:rPr>
         <w:t>Webinar</w:t>
       </w:r>
       <w:proofErr w:type="spellEnd"/>
       <w:r>
-        <w:rPr>
-          <w:rFonts w:asciiTheme="minorHAnsi" w:hAnsiTheme="minorHAnsi" w:cstheme="minorHAnsi"/>
-          <w:sz w:val="28"/>
-          <w:szCs w:val="28"/>
-        </w:rPr>
         <w:t>].</w:t>
       </w:r>
       <w:r>
-        <w:rPr>
-          <w:rFonts w:asciiTheme="minorHAnsi" w:hAnsiTheme="minorHAnsi" w:cstheme="minorHAnsi"/>
-          <w:sz w:val="28"/>
-          <w:szCs w:val="28"/>
-        </w:rPr>
         <w:t xml:space="preserve"> </w:t>
       </w:r>
       <w:hyperlink r:id="rId19" w:history="1">
         <w:r>
           <w:rPr>
             <w:rStyle w:val="Hipervnculo"/>
-            <w:rFonts w:asciiTheme="minorHAnsi" w:hAnsiTheme="minorHAnsi" w:cstheme="minorHAnsi"/>
-            <w:sz w:val="28"/>
+            <w:rFonts w:cstheme="minorHAnsi"/>
             <w:szCs w:val="28"/>
           </w:rPr>
           <w:t>https://www.youtube.com/watch?v=-_8tNwzyCi8</w:t>
         </w:r>
       </w:hyperlink>
       <w:r>
-        <w:rPr>
-          <w:rFonts w:asciiTheme="minorHAnsi" w:hAnsiTheme="minorHAnsi" w:cstheme="minorHAnsi"/>
-          <w:sz w:val="28"/>
-          <w:szCs w:val="28"/>
-        </w:rPr>
         <w:t xml:space="preserve"> </w:t>
       </w:r>
     </w:p>
     <w:p>
-      <w:pPr>
-        <w:pStyle w:val="Normal0"/>
-        <w:ind w:firstLine="708"/>
-        <w:rPr>
-          <w:rFonts w:asciiTheme="minorHAnsi" w:hAnsiTheme="minorHAnsi" w:cstheme="minorHAnsi"/>
-          <w:sz w:val="28"/>
-          <w:szCs w:val="28"/>
-        </w:rPr>
-      </w:pPr>
-    </w:p>
-    <w:p>
-      <w:pPr>
-        <w:pStyle w:val="Normal0"/>
-        <w:ind w:firstLine="708"/>
-        <w:rPr>
-          <w:rFonts w:asciiTheme="minorHAnsi" w:hAnsiTheme="minorHAnsi" w:cstheme="minorHAnsi"/>
-          <w:sz w:val="28"/>
-          <w:szCs w:val="28"/>
-        </w:rPr>
-      </w:pPr>
-      <w:r>
-        <w:rPr>
-          <w:rFonts w:asciiTheme="minorHAnsi" w:hAnsiTheme="minorHAnsi" w:cstheme="minorHAnsi"/>
-          <w:sz w:val="28"/>
-          <w:szCs w:val="28"/>
-        </w:rPr>
-        <w:t>Maciá, F. y Santoja, M. (2017). Marketing en redes sociales.</w:t>
-      </w:r>
-      <w:r>
-        <w:rPr>
-          <w:rFonts w:asciiTheme="minorHAnsi" w:hAnsiTheme="minorHAnsi" w:cstheme="minorHAnsi"/>
-          <w:sz w:val="28"/>
-          <w:szCs w:val="28"/>
-        </w:rPr>
+      <w:r>
+        <w:t xml:space="preserve">Maciá, F. y Santoja, M. (2017). </w:t>
+      </w:r>
+      <w:r>
+        <w:rPr>
+          <w:rStyle w:val="Extranjerismo"/>
+        </w:rPr>
+        <w:t>Marketing</w:t>
+      </w:r>
+      <w:r>
+        <w:t xml:space="preserve"> en redes sociales.</w:t>
+      </w:r>
+      <w:r>
         <w:t xml:space="preserve"> </w:t>
       </w:r>
       <w:r>
-        <w:rPr>
-          <w:rFonts w:asciiTheme="minorHAnsi" w:hAnsiTheme="minorHAnsi" w:cstheme="minorHAnsi"/>
-          <w:sz w:val="28"/>
-          <w:szCs w:val="28"/>
-        </w:rPr>
         <w:t xml:space="preserve"> Anaya.</w:t>
       </w:r>
       <w:r>
-        <w:rPr>
-          <w:rFonts w:asciiTheme="minorHAnsi" w:hAnsiTheme="minorHAnsi" w:cstheme="minorHAnsi"/>
-          <w:sz w:val="28"/>
-          <w:szCs w:val="28"/>
-        </w:rPr>
         <w:t xml:space="preserve"> </w:t>
       </w:r>
       <w:hyperlink r:id="rId20" w:history="1">
         <w:r>
           <w:rPr>
             <w:rStyle w:val="Hipervnculo"/>
-            <w:rFonts w:asciiTheme="minorHAnsi" w:hAnsiTheme="minorHAnsi" w:cstheme="minorHAnsi"/>
-            <w:sz w:val="28"/>
+            <w:rFonts w:cstheme="minorHAnsi"/>
             <w:szCs w:val="28"/>
           </w:rPr>
           <w:t>http://www.ebooks7-24.com.bdigital.sena.edu.co/?il=13656</w:t>
         </w:r>
       </w:hyperlink>
       <w:r>
-        <w:rPr>
-          <w:rFonts w:asciiTheme="minorHAnsi" w:hAnsiTheme="minorHAnsi" w:cstheme="minorHAnsi"/>
-          <w:sz w:val="28"/>
-          <w:szCs w:val="28"/>
-        </w:rPr>
         <w:t xml:space="preserve"> </w:t>
       </w:r>
       <w:r>
-        <w:rPr>
-          <w:rFonts w:asciiTheme="minorHAnsi" w:hAnsiTheme="minorHAnsi" w:cstheme="minorHAnsi"/>
-          <w:sz w:val="28"/>
-          <w:szCs w:val="28"/>
-        </w:rPr>
         <w:tab/>
       </w:r>
       <w:r>
-        <w:rPr>
-          <w:rFonts w:asciiTheme="minorHAnsi" w:hAnsiTheme="minorHAnsi" w:cstheme="minorHAnsi"/>
-          <w:sz w:val="28"/>
-          <w:szCs w:val="28"/>
-        </w:rPr>
         <w:tab/>
       </w:r>
       <w:r>
-        <w:rPr>
-          <w:rFonts w:asciiTheme="minorHAnsi" w:hAnsiTheme="minorHAnsi" w:cstheme="minorHAnsi"/>
-          <w:sz w:val="28"/>
-          <w:szCs w:val="28"/>
-        </w:rPr>
         <w:tab/>
       </w:r>
       <w:r>
-        <w:rPr>
-          <w:rFonts w:asciiTheme="minorHAnsi" w:hAnsiTheme="minorHAnsi" w:cstheme="minorHAnsi"/>
-          <w:sz w:val="28"/>
-          <w:szCs w:val="28"/>
-        </w:rPr>
         <w:t xml:space="preserve"> </w:t>
       </w:r>
     </w:p>
     <w:p>
-      <w:pPr>
-        <w:pStyle w:val="Normal0"/>
-        <w:ind w:firstLine="708"/>
-        <w:rPr>
-          <w:rFonts w:asciiTheme="minorHAnsi" w:hAnsiTheme="minorHAnsi" w:cstheme="minorHAnsi"/>
-          <w:sz w:val="28"/>
-          <w:szCs w:val="28"/>
-        </w:rPr>
-      </w:pPr>
-    </w:p>
-    <w:p>
-      <w:pPr>
-        <w:pStyle w:val="Normal0"/>
-        <w:ind w:firstLine="708"/>
-        <w:rPr>
-          <w:rFonts w:asciiTheme="minorHAnsi" w:hAnsiTheme="minorHAnsi" w:cstheme="minorHAnsi"/>
-          <w:sz w:val="28"/>
-          <w:szCs w:val="28"/>
-        </w:rPr>
-      </w:pPr>
-      <w:r>
-        <w:rPr>
-          <w:rFonts w:asciiTheme="minorHAnsi" w:hAnsiTheme="minorHAnsi" w:cstheme="minorHAnsi"/>
-          <w:sz w:val="28"/>
-          <w:szCs w:val="28"/>
-        </w:rPr>
-        <w:t>Mejía, J. (2020). Indicadores de redes sociales: principales KPI y métricas de social media.</w:t>
-      </w:r>
-    </w:p>
-    <w:p>
-      <w:pPr>
-        <w:pStyle w:val="Normal0"/>
-        <w:ind w:firstLine="708"/>
-        <w:rPr>
-          <w:rFonts w:asciiTheme="minorHAnsi" w:hAnsiTheme="minorHAnsi" w:cstheme="minorHAnsi"/>
-          <w:sz w:val="28"/>
-          <w:szCs w:val="28"/>
-        </w:rPr>
-      </w:pPr>
-    </w:p>
-    <w:p>
-      <w:pPr>
-        <w:pStyle w:val="Normal0"/>
-        <w:ind w:firstLine="708"/>
-        <w:rPr>
-          <w:rFonts w:asciiTheme="minorHAnsi" w:hAnsiTheme="minorHAnsi" w:cstheme="minorHAnsi"/>
-          <w:sz w:val="28"/>
-          <w:szCs w:val="28"/>
-        </w:rPr>
-      </w:pPr>
-      <w:r>
-        <w:rPr>
-          <w:rFonts w:asciiTheme="minorHAnsi" w:hAnsiTheme="minorHAnsi" w:cstheme="minorHAnsi"/>
-          <w:sz w:val="28"/>
-          <w:szCs w:val="28"/>
-        </w:rPr>
+      <w:r>
+        <w:t xml:space="preserve">Mejía, J. (2020). Indicadores de redes sociales: principales </w:t>
+      </w:r>
+      <w:r>
+        <w:t>KPI</w:t>
+      </w:r>
+      <w:r>
+        <w:t xml:space="preserve"> y métricas de </w:t>
+      </w:r>
+      <w:r>
+        <w:rPr>
+          <w:rStyle w:val="Extranjerismo"/>
+        </w:rPr>
+        <w:t>social media</w:t>
+      </w:r>
+      <w:r>
+        <w:t>.</w:t>
+      </w:r>
+    </w:p>
+    <w:p>
+      <w:r>
+        <w:lastRenderedPageBreak/>
         <w:t>Núñez, V. (2013). Cómo hacer un informe de resultados en redes sociales.</w:t>
       </w:r>
       <w:r>
-        <w:rPr>
-          <w:rFonts w:asciiTheme="minorHAnsi" w:hAnsiTheme="minorHAnsi" w:cstheme="minorHAnsi"/>
-          <w:sz w:val="28"/>
-          <w:szCs w:val="28"/>
-        </w:rPr>
         <w:t xml:space="preserve"> </w:t>
       </w:r>
       <w:hyperlink r:id="rId21" w:history="1">
         <w:r>
           <w:rPr>
             <w:rStyle w:val="Hipervnculo"/>
-            <w:rFonts w:asciiTheme="minorHAnsi" w:hAnsiTheme="minorHAnsi" w:cstheme="minorHAnsi"/>
-            <w:sz w:val="28"/>
+            <w:rFonts w:cstheme="minorHAnsi"/>
             <w:szCs w:val="28"/>
           </w:rPr>
           <w:t>https://vilmanunez.com/como-hacer-un-informe-de-redes-sociales-incluye-plantillas/</w:t>
         </w:r>
       </w:hyperlink>
       <w:r>
-        <w:rPr>
-          <w:rFonts w:asciiTheme="minorHAnsi" w:hAnsiTheme="minorHAnsi" w:cstheme="minorHAnsi"/>
-          <w:sz w:val="28"/>
-          <w:szCs w:val="28"/>
-        </w:rPr>
         <w:t xml:space="preserve"> </w:t>
       </w:r>
     </w:p>
     <w:p>
-      <w:pPr>
-        <w:pStyle w:val="Normal0"/>
-        <w:ind w:firstLine="708"/>
-        <w:rPr>
-          <w:rFonts w:asciiTheme="minorHAnsi" w:hAnsiTheme="minorHAnsi" w:cstheme="minorHAnsi"/>
-          <w:sz w:val="28"/>
-          <w:szCs w:val="28"/>
-        </w:rPr>
-      </w:pPr>
-      <w:r>
-        <w:rPr>
-          <w:rFonts w:asciiTheme="minorHAnsi" w:hAnsiTheme="minorHAnsi" w:cstheme="minorHAnsi"/>
-          <w:sz w:val="28"/>
-          <w:szCs w:val="28"/>
-        </w:rPr>
-        <w:lastRenderedPageBreak/>
+      <w:r>
         <w:t>Redes Sociales. (2021). Redes sociales: ¿qué son las redes sociales?</w:t>
       </w:r>
       <w:r>
-        <w:rPr>
-          <w:rFonts w:asciiTheme="minorHAnsi" w:hAnsiTheme="minorHAnsi" w:cstheme="minorHAnsi"/>
-          <w:sz w:val="28"/>
-          <w:szCs w:val="28"/>
-        </w:rPr>
         <w:t xml:space="preserve"> </w:t>
       </w:r>
-      <w:hyperlink r:id="rId22" w:history="1">
+      <w:hyperlink r:id="rId22" w:anchor=":~:text=Las%20redes%20sociales%20son%20estructuras,sin%20jerarqu%C3%ADa%20o%20l%C3%ADmites%20f%C3%ADsicos" w:history="1">
         <w:r>
           <w:rPr>
             <w:rStyle w:val="Hipervnculo"/>
-            <w:rFonts w:asciiTheme="minorHAnsi" w:hAnsiTheme="minorHAnsi" w:cstheme="minorHAnsi"/>
-            <w:sz w:val="28"/>
+            <w:rFonts w:cstheme="minorHAnsi"/>
             <w:szCs w:val="28"/>
           </w:rPr>
           <w:t>https://www.rdstation.com/es/redes%20sociales/#:~:text=Las%20redes%20sociales%20son%20estructuras,sin%20jerarqu%C3%ADa%20o%20l%C3%ADmites%20f%C3%ADsicos</w:t>
         </w:r>
       </w:hyperlink>
       <w:r>
-        <w:rPr>
-          <w:rFonts w:asciiTheme="minorHAnsi" w:hAnsiTheme="minorHAnsi" w:cstheme="minorHAnsi"/>
-          <w:sz w:val="28"/>
-          <w:szCs w:val="28"/>
-        </w:rPr>
         <w:t xml:space="preserve"> </w:t>
       </w:r>
       <w:r>
-        <w:rPr>
-          <w:rFonts w:asciiTheme="minorHAnsi" w:hAnsiTheme="minorHAnsi" w:cstheme="minorHAnsi"/>
-          <w:sz w:val="28"/>
-          <w:szCs w:val="28"/>
-        </w:rPr>
         <w:tab/>
       </w:r>
       <w:r>
-        <w:rPr>
-          <w:rFonts w:asciiTheme="minorHAnsi" w:hAnsiTheme="minorHAnsi" w:cstheme="minorHAnsi"/>
-          <w:sz w:val="28"/>
-          <w:szCs w:val="28"/>
-        </w:rPr>
         <w:tab/>
       </w:r>
       <w:r>
-        <w:rPr>
-          <w:rFonts w:asciiTheme="minorHAnsi" w:hAnsiTheme="minorHAnsi" w:cstheme="minorHAnsi"/>
-          <w:sz w:val="28"/>
-          <w:szCs w:val="28"/>
-        </w:rPr>
         <w:tab/>
       </w:r>
       <w:r>
-        <w:rPr>
-          <w:rFonts w:asciiTheme="minorHAnsi" w:hAnsiTheme="minorHAnsi" w:cstheme="minorHAnsi"/>
-          <w:sz w:val="28"/>
-          <w:szCs w:val="28"/>
-        </w:rPr>
         <w:tab/>
       </w:r>
       <w:r>
-        <w:rPr>
-          <w:rFonts w:asciiTheme="minorHAnsi" w:hAnsiTheme="minorHAnsi" w:cstheme="minorHAnsi"/>
-          <w:sz w:val="28"/>
-          <w:szCs w:val="28"/>
-        </w:rPr>
         <w:tab/>
       </w:r>
       <w:r>
-        <w:rPr>
-          <w:rFonts w:asciiTheme="minorHAnsi" w:hAnsiTheme="minorHAnsi" w:cstheme="minorHAnsi"/>
-          <w:sz w:val="28"/>
-          <w:szCs w:val="28"/>
-        </w:rPr>
         <w:tab/>
       </w:r>
       <w:r>
-        <w:rPr>
-          <w:rFonts w:asciiTheme="minorHAnsi" w:hAnsiTheme="minorHAnsi" w:cstheme="minorHAnsi"/>
-          <w:sz w:val="28"/>
-          <w:szCs w:val="28"/>
-        </w:rPr>
         <w:tab/>
       </w:r>
       <w:r>
-        <w:rPr>
-          <w:rFonts w:asciiTheme="minorHAnsi" w:hAnsiTheme="minorHAnsi" w:cstheme="minorHAnsi"/>
-          <w:sz w:val="28"/>
-          <w:szCs w:val="28"/>
-        </w:rPr>
         <w:tab/>
       </w:r>
       <w:r>
-        <w:rPr>
-          <w:rFonts w:asciiTheme="minorHAnsi" w:hAnsiTheme="minorHAnsi" w:cstheme="minorHAnsi"/>
-          <w:sz w:val="28"/>
-          <w:szCs w:val="28"/>
-        </w:rPr>
         <w:tab/>
       </w:r>
       <w:r>
-        <w:rPr>
-          <w:rFonts w:asciiTheme="minorHAnsi" w:hAnsiTheme="minorHAnsi" w:cstheme="minorHAnsi"/>
-          <w:sz w:val="28"/>
-          <w:szCs w:val="28"/>
-        </w:rPr>
         <w:tab/>
       </w:r>
       <w:r>
-        <w:rPr>
-          <w:rFonts w:asciiTheme="minorHAnsi" w:hAnsiTheme="minorHAnsi" w:cstheme="minorHAnsi"/>
-          <w:sz w:val="28"/>
-          <w:szCs w:val="28"/>
-        </w:rPr>
         <w:tab/>
       </w:r>
       <w:r>
-        <w:rPr>
-          <w:rFonts w:asciiTheme="minorHAnsi" w:hAnsiTheme="minorHAnsi" w:cstheme="minorHAnsi"/>
-          <w:sz w:val="28"/>
-          <w:szCs w:val="28"/>
-        </w:rPr>
         <w:tab/>
       </w:r>
       <w:r>
-        <w:rPr>
-          <w:rFonts w:asciiTheme="minorHAnsi" w:hAnsiTheme="minorHAnsi" w:cstheme="minorHAnsi"/>
-          <w:sz w:val="28"/>
-          <w:szCs w:val="28"/>
-        </w:rPr>
         <w:tab/>
       </w:r>
       <w:r>
-        <w:rPr>
-          <w:rFonts w:asciiTheme="minorHAnsi" w:hAnsiTheme="minorHAnsi" w:cstheme="minorHAnsi"/>
-          <w:sz w:val="28"/>
-          <w:szCs w:val="28"/>
-        </w:rPr>
         <w:tab/>
       </w:r>
       <w:r>
-        <w:rPr>
-          <w:rFonts w:asciiTheme="minorHAnsi" w:hAnsiTheme="minorHAnsi" w:cstheme="minorHAnsi"/>
-          <w:sz w:val="28"/>
-          <w:szCs w:val="28"/>
-        </w:rPr>
         <w:tab/>
       </w:r>
       <w:r>
-        <w:rPr>
-          <w:rFonts w:asciiTheme="minorHAnsi" w:hAnsiTheme="minorHAnsi" w:cstheme="minorHAnsi"/>
-          <w:sz w:val="28"/>
-          <w:szCs w:val="28"/>
-        </w:rPr>
         <w:tab/>
       </w:r>
       <w:r>
-        <w:rPr>
-          <w:rFonts w:asciiTheme="minorHAnsi" w:hAnsiTheme="minorHAnsi" w:cstheme="minorHAnsi"/>
-          <w:sz w:val="28"/>
-          <w:szCs w:val="28"/>
-        </w:rPr>
         <w:tab/>
       </w:r>
       <w:r>
-        <w:rPr>
-          <w:rFonts w:asciiTheme="minorHAnsi" w:hAnsiTheme="minorHAnsi" w:cstheme="minorHAnsi"/>
-          <w:sz w:val="28"/>
-          <w:szCs w:val="28"/>
-        </w:rPr>
         <w:tab/>
       </w:r>
       <w:r>
-        <w:rPr>
-          <w:rFonts w:asciiTheme="minorHAnsi" w:hAnsiTheme="minorHAnsi" w:cstheme="minorHAnsi"/>
-          <w:sz w:val="28"/>
-          <w:szCs w:val="28"/>
-        </w:rPr>
         <w:tab/>
       </w:r>
       <w:r>
-        <w:rPr>
-          <w:rFonts w:asciiTheme="minorHAnsi" w:hAnsiTheme="minorHAnsi" w:cstheme="minorHAnsi"/>
-          <w:sz w:val="28"/>
-          <w:szCs w:val="28"/>
-        </w:rPr>
         <w:tab/>
       </w:r>
       <w:r>
-        <w:rPr>
-          <w:rFonts w:asciiTheme="minorHAnsi" w:hAnsiTheme="minorHAnsi" w:cstheme="minorHAnsi"/>
-          <w:sz w:val="28"/>
-          <w:szCs w:val="28"/>
-        </w:rPr>
         <w:tab/>
       </w:r>
       <w:r>
-        <w:rPr>
-          <w:rFonts w:asciiTheme="minorHAnsi" w:hAnsiTheme="minorHAnsi" w:cstheme="minorHAnsi"/>
-          <w:sz w:val="28"/>
-          <w:szCs w:val="28"/>
-        </w:rPr>
         <w:tab/>
       </w:r>
       <w:r>
-        <w:rPr>
-          <w:rFonts w:asciiTheme="minorHAnsi" w:hAnsiTheme="minorHAnsi" w:cstheme="minorHAnsi"/>
-          <w:sz w:val="28"/>
-          <w:szCs w:val="28"/>
-        </w:rPr>
         <w:tab/>
       </w:r>
       <w:r>
-        <w:rPr>
-          <w:rFonts w:asciiTheme="minorHAnsi" w:hAnsiTheme="minorHAnsi" w:cstheme="minorHAnsi"/>
-          <w:sz w:val="28"/>
-          <w:szCs w:val="28"/>
-        </w:rPr>
         <w:tab/>
       </w:r>
       <w:r>
-        <w:rPr>
-          <w:rFonts w:asciiTheme="minorHAnsi" w:hAnsiTheme="minorHAnsi" w:cstheme="minorHAnsi"/>
-          <w:sz w:val="28"/>
-          <w:szCs w:val="28"/>
-        </w:rPr>
         <w:tab/>
       </w:r>
       <w:r>
-        <w:rPr>
-          <w:rFonts w:asciiTheme="minorHAnsi" w:hAnsiTheme="minorHAnsi" w:cstheme="minorHAnsi"/>
-          <w:sz w:val="28"/>
-          <w:szCs w:val="28"/>
-        </w:rPr>
         <w:tab/>
       </w:r>
       <w:r>
-        <w:rPr>
-          <w:rFonts w:asciiTheme="minorHAnsi" w:hAnsiTheme="minorHAnsi" w:cstheme="minorHAnsi"/>
-          <w:sz w:val="28"/>
-          <w:szCs w:val="28"/>
-        </w:rPr>
         <w:tab/>
       </w:r>
       <w:r>
-        <w:rPr>
-          <w:rFonts w:asciiTheme="minorHAnsi" w:hAnsiTheme="minorHAnsi" w:cstheme="minorHAnsi"/>
-          <w:sz w:val="28"/>
-          <w:szCs w:val="28"/>
-        </w:rPr>
         <w:tab/>
         <w:t xml:space="preserve"> </w:t>
       </w:r>
       <w:r>
-        <w:rPr>
-          <w:rFonts w:asciiTheme="minorHAnsi" w:hAnsiTheme="minorHAnsi" w:cstheme="minorHAnsi"/>
-          <w:sz w:val="28"/>
-          <w:szCs w:val="28"/>
-        </w:rPr>
         <w:tab/>
       </w:r>
       <w:r>
-        <w:rPr>
-          <w:rFonts w:asciiTheme="minorHAnsi" w:hAnsiTheme="minorHAnsi" w:cstheme="minorHAnsi"/>
-          <w:sz w:val="28"/>
-          <w:szCs w:val="28"/>
-        </w:rPr>
         <w:tab/>
       </w:r>
       <w:r>
-        <w:rPr>
-          <w:rFonts w:asciiTheme="minorHAnsi" w:hAnsiTheme="minorHAnsi" w:cstheme="minorHAnsi"/>
-          <w:sz w:val="28"/>
-          <w:szCs w:val="28"/>
-        </w:rPr>
         <w:tab/>
       </w:r>
       <w:r>
-        <w:rPr>
-          <w:rFonts w:asciiTheme="minorHAnsi" w:hAnsiTheme="minorHAnsi" w:cstheme="minorHAnsi"/>
-          <w:sz w:val="28"/>
-          <w:szCs w:val="28"/>
-        </w:rPr>
         <w:tab/>
       </w:r>
       <w:r>
-        <w:rPr>
-          <w:rFonts w:asciiTheme="minorHAnsi" w:hAnsiTheme="minorHAnsi" w:cstheme="minorHAnsi"/>
-          <w:sz w:val="28"/>
-          <w:szCs w:val="28"/>
-        </w:rPr>
         <w:tab/>
       </w:r>
       <w:r>
-        <w:rPr>
-          <w:rFonts w:asciiTheme="minorHAnsi" w:hAnsiTheme="minorHAnsi" w:cstheme="minorHAnsi"/>
-          <w:sz w:val="28"/>
-          <w:szCs w:val="28"/>
-        </w:rPr>
         <w:tab/>
       </w:r>
       <w:r>
-        <w:rPr>
-          <w:rFonts w:asciiTheme="minorHAnsi" w:hAnsiTheme="minorHAnsi" w:cstheme="minorHAnsi"/>
-          <w:sz w:val="28"/>
-          <w:szCs w:val="28"/>
-        </w:rPr>
         <w:tab/>
       </w:r>
       <w:r>
-        <w:rPr>
-          <w:rFonts w:asciiTheme="minorHAnsi" w:hAnsiTheme="minorHAnsi" w:cstheme="minorHAnsi"/>
-          <w:sz w:val="28"/>
-          <w:szCs w:val="28"/>
-        </w:rPr>
         <w:tab/>
       </w:r>
       <w:r>
-        <w:rPr>
-          <w:rFonts w:asciiTheme="minorHAnsi" w:hAnsiTheme="minorHAnsi" w:cstheme="minorHAnsi"/>
-          <w:sz w:val="28"/>
-          <w:szCs w:val="28"/>
-        </w:rPr>
         <w:tab/>
       </w:r>
       <w:r>
-        <w:rPr>
-          <w:rFonts w:asciiTheme="minorHAnsi" w:hAnsiTheme="minorHAnsi" w:cstheme="minorHAnsi"/>
-          <w:sz w:val="28"/>
-          <w:szCs w:val="28"/>
-        </w:rPr>
         <w:tab/>
       </w:r>
       <w:r>
-        <w:rPr>
-          <w:rFonts w:asciiTheme="minorHAnsi" w:hAnsiTheme="minorHAnsi" w:cstheme="minorHAnsi"/>
-          <w:sz w:val="28"/>
-          <w:szCs w:val="28"/>
-        </w:rPr>
         <w:tab/>
       </w:r>
       <w:r>
-        <w:rPr>
-          <w:rFonts w:asciiTheme="minorHAnsi" w:hAnsiTheme="minorHAnsi" w:cstheme="minorHAnsi"/>
-          <w:sz w:val="28"/>
-          <w:szCs w:val="28"/>
-        </w:rPr>
         <w:tab/>
       </w:r>
       <w:r>
-        <w:rPr>
-          <w:rFonts w:asciiTheme="minorHAnsi" w:hAnsiTheme="minorHAnsi" w:cstheme="minorHAnsi"/>
-          <w:sz w:val="28"/>
-          <w:szCs w:val="28"/>
-        </w:rPr>
         <w:tab/>
       </w:r>
       <w:r>
-        <w:rPr>
-          <w:rFonts w:asciiTheme="minorHAnsi" w:hAnsiTheme="minorHAnsi" w:cstheme="minorHAnsi"/>
-          <w:sz w:val="28"/>
-          <w:szCs w:val="28"/>
-        </w:rPr>
         <w:tab/>
       </w:r>
       <w:r>
-        <w:rPr>
-          <w:rFonts w:asciiTheme="minorHAnsi" w:hAnsiTheme="minorHAnsi" w:cstheme="minorHAnsi"/>
-          <w:sz w:val="28"/>
-          <w:szCs w:val="28"/>
-        </w:rPr>
         <w:tab/>
       </w:r>
       <w:r>
-        <w:rPr>
-          <w:rFonts w:asciiTheme="minorHAnsi" w:hAnsiTheme="minorHAnsi" w:cstheme="minorHAnsi"/>
-          <w:sz w:val="28"/>
-          <w:szCs w:val="28"/>
-        </w:rPr>
         <w:tab/>
       </w:r>
       <w:r>
-        <w:rPr>
-          <w:rFonts w:asciiTheme="minorHAnsi" w:hAnsiTheme="minorHAnsi" w:cstheme="minorHAnsi"/>
-          <w:sz w:val="28"/>
-          <w:szCs w:val="28"/>
-        </w:rPr>
         <w:tab/>
       </w:r>
       <w:r>
-        <w:rPr>
-          <w:rFonts w:asciiTheme="minorHAnsi" w:hAnsiTheme="minorHAnsi" w:cstheme="minorHAnsi"/>
-          <w:sz w:val="28"/>
-          <w:szCs w:val="28"/>
-        </w:rPr>
         <w:tab/>
       </w:r>
       <w:r>
-        <w:rPr>
-          <w:rFonts w:asciiTheme="minorHAnsi" w:hAnsiTheme="minorHAnsi" w:cstheme="minorHAnsi"/>
-          <w:sz w:val="28"/>
-          <w:szCs w:val="28"/>
-        </w:rPr>
         <w:tab/>
       </w:r>
       <w:r>
-        <w:rPr>
-          <w:rFonts w:asciiTheme="minorHAnsi" w:hAnsiTheme="minorHAnsi" w:cstheme="minorHAnsi"/>
-          <w:sz w:val="28"/>
-          <w:szCs w:val="28"/>
-        </w:rPr>
         <w:tab/>
       </w:r>
       <w:r>
-        <w:rPr>
-          <w:rFonts w:asciiTheme="minorHAnsi" w:hAnsiTheme="minorHAnsi" w:cstheme="minorHAnsi"/>
-          <w:sz w:val="28"/>
-          <w:szCs w:val="28"/>
-        </w:rPr>
         <w:tab/>
       </w:r>
       <w:r>
-        <w:rPr>
-          <w:rFonts w:asciiTheme="minorHAnsi" w:hAnsiTheme="minorHAnsi" w:cstheme="minorHAnsi"/>
-          <w:sz w:val="28"/>
-          <w:szCs w:val="28"/>
-        </w:rPr>
         <w:tab/>
       </w:r>
       <w:r>
-        <w:rPr>
-          <w:rFonts w:asciiTheme="minorHAnsi" w:hAnsiTheme="minorHAnsi" w:cstheme="minorHAnsi"/>
-          <w:sz w:val="28"/>
-          <w:szCs w:val="28"/>
-        </w:rPr>
         <w:tab/>
       </w:r>
       <w:r>
-        <w:rPr>
-          <w:rFonts w:asciiTheme="minorHAnsi" w:hAnsiTheme="minorHAnsi" w:cstheme="minorHAnsi"/>
-          <w:sz w:val="28"/>
-          <w:szCs w:val="28"/>
-        </w:rPr>
         <w:tab/>
       </w:r>
       <w:r>
-        <w:rPr>
-          <w:rFonts w:asciiTheme="minorHAnsi" w:hAnsiTheme="minorHAnsi" w:cstheme="minorHAnsi"/>
-          <w:sz w:val="28"/>
-          <w:szCs w:val="28"/>
-        </w:rPr>
         <w:tab/>
       </w:r>
       <w:r>
-        <w:rPr>
-          <w:rFonts w:asciiTheme="minorHAnsi" w:hAnsiTheme="minorHAnsi" w:cstheme="minorHAnsi"/>
-          <w:sz w:val="28"/>
-          <w:szCs w:val="28"/>
-        </w:rPr>
         <w:tab/>
       </w:r>
       <w:r>
-        <w:rPr>
-          <w:rFonts w:asciiTheme="minorHAnsi" w:hAnsiTheme="minorHAnsi" w:cstheme="minorHAnsi"/>
-          <w:sz w:val="28"/>
-          <w:szCs w:val="28"/>
-        </w:rPr>
         <w:tab/>
       </w:r>
       <w:r>
-        <w:rPr>
-          <w:rFonts w:asciiTheme="minorHAnsi" w:hAnsiTheme="minorHAnsi" w:cstheme="minorHAnsi"/>
-          <w:sz w:val="28"/>
-          <w:szCs w:val="28"/>
-        </w:rPr>
         <w:tab/>
       </w:r>
       <w:r>
-        <w:rPr>
-          <w:rFonts w:asciiTheme="minorHAnsi" w:hAnsiTheme="minorHAnsi" w:cstheme="minorHAnsi"/>
-          <w:sz w:val="28"/>
-          <w:szCs w:val="28"/>
-        </w:rPr>
         <w:tab/>
       </w:r>
       <w:r>
-        <w:rPr>
-          <w:rFonts w:asciiTheme="minorHAnsi" w:hAnsiTheme="minorHAnsi" w:cstheme="minorHAnsi"/>
-          <w:sz w:val="28"/>
-          <w:szCs w:val="28"/>
-        </w:rPr>
         <w:tab/>
       </w:r>
       <w:r>
-        <w:rPr>
-          <w:rFonts w:asciiTheme="minorHAnsi" w:hAnsiTheme="minorHAnsi" w:cstheme="minorHAnsi"/>
-          <w:sz w:val="28"/>
-          <w:szCs w:val="28"/>
-        </w:rPr>
         <w:tab/>
       </w:r>
       <w:r>
-        <w:rPr>
-          <w:rFonts w:asciiTheme="minorHAnsi" w:hAnsiTheme="minorHAnsi" w:cstheme="minorHAnsi"/>
-          <w:sz w:val="28"/>
-          <w:szCs w:val="28"/>
-        </w:rPr>
         <w:tab/>
       </w:r>
     </w:p>
@@ -7702,6 +7271,7 @@
       <w:pPr>
         <w:pStyle w:val="Titulosgenerales"/>
       </w:pPr>
+      <w:bookmarkStart w:id="21" w:name="_Toc227072239"/>
       <w:r>
         <w:lastRenderedPageBreak/>
         <w:t>C</w:t>
@@ -7709,7 +7279,7 @@
       <w:r>
         <w:t>réditos</w:t>
       </w:r>
-      <w:bookmarkEnd w:id="19"/>
+      <w:bookmarkEnd w:id="21"/>
     </w:p>
     <w:tbl>
       <w:tblPr>
@@ -8826,6 +8396,7 @@
         <w:docPartUnique/>
       </w:docPartObj>
     </w:sdtPr>
+    <w:sdtEndPr/>
     <w:sdtContent>
       <w:p>
         <w:pPr>
@@ -8853,6 +8424,7 @@
         <w:docPartUnique/>
       </w:docPartObj>
     </w:sdtPr>
+    <w:sdtEndPr/>
     <w:sdtContent>
       <w:p>
         <w:pPr>
@@ -10966,8 +10538,8 @@
   <w:abstractNum w:abstractNumId="18" w15:restartNumberingAfterBreak="0">
     <w:nsid w:val="5F1B4BD0"/>
     <w:multiLevelType w:val="hybridMultilevel"/>
-    <w:tmpl w:val="60DE93F0"/>
-    <w:lvl w:ilvl="0" w:tplc="240A0015">
+    <w:tmpl w:val="0BE4AF7E"/>
+    <w:lvl w:ilvl="0" w:tplc="F01E3CC0">
       <w:start w:val="1"/>
       <w:numFmt w:val="upperLetter"/>
       <w:lvlText w:val="%1."/>
@@ -10975,6 +10547,10 @@
       <w:pPr>
         <w:ind w:left="1429" w:hanging="360"/>
       </w:pPr>
+      <w:rPr>
+        <w:b/>
+        <w:bCs/>
+      </w:rPr>
     </w:lvl>
     <w:lvl w:ilvl="1" w:tplc="240A0019" w:tentative="1">
       <w:start w:val="1"/>
@@ -13100,6 +12676,7 @@
   <w:style w:type="character" w:default="1" w:styleId="Fuentedeprrafopredeter">
     <w:name w:val="Default Paragraph Font"/>
     <w:uiPriority w:val="1"/>
+    <w:semiHidden/>
     <w:unhideWhenUsed/>
   </w:style>
   <w:style w:type="table" w:default="1" w:styleId="Tablanormal">
@@ -14260,30 +13837,27 @@
 </file>
 
 <file path=customXml/item1.xml><?xml version="1.0" encoding="utf-8"?>
-<ct:contentTypeSchema xmlns:ct="http://schemas.microsoft.com/office/2006/metadata/contentType" xmlns:ma="http://schemas.microsoft.com/office/2006/metadata/properties/metaAttributes" ct:_="" ma:_="" ma:contentTypeName="Documento" ma:contentTypeID="0x0101006A81D6BD42E8DF4C91013959704817E1" ma:contentTypeVersion="15" ma:contentTypeDescription="Crear nuevo documento." ma:contentTypeScope="" ma:versionID="bf4f72ffd194f0963ff564daca6869f7">
-  <xsd:schema xmlns:xsd="http://www.w3.org/2001/XMLSchema" xmlns:xs="http://www.w3.org/2001/XMLSchema" xmlns:p="http://schemas.microsoft.com/office/2006/metadata/properties" xmlns:ns2="13c90a0b-73bc-4dc0-be5f-28d77b615beb" xmlns:ns3="13c93bba-48ce-428c-bfe5-88b42c19b028" targetNamespace="http://schemas.microsoft.com/office/2006/metadata/properties" ma:root="true" ma:fieldsID="8718d6f4873a5b1392a45044efa78385" ns2:_="" ns3:_="">
-    <xsd:import namespace="13c90a0b-73bc-4dc0-be5f-28d77b615beb"/>
-    <xsd:import namespace="13c93bba-48ce-428c-bfe5-88b42c19b028"/>
+<ct:contentTypeSchema xmlns:ct="http://schemas.microsoft.com/office/2006/metadata/contentType" xmlns:ma="http://schemas.microsoft.com/office/2006/metadata/properties/metaAttributes" ct:_="" ma:_="" ma:contentTypeName="Documento" ma:contentTypeID="0x010100FC2B1768DD5A774EB396CCAB0DE361C1" ma:contentTypeVersion="12" ma:contentTypeDescription="Crear nuevo documento." ma:contentTypeScope="" ma:versionID="d4a546b22d2924edabf51241cf3422b8">
+  <xsd:schema xmlns:xsd="http://www.w3.org/2001/XMLSchema" xmlns:xs="http://www.w3.org/2001/XMLSchema" xmlns:p="http://schemas.microsoft.com/office/2006/metadata/properties" xmlns:ns2="a70d3c18-0869-45a1-9f75-4b4b8f0f32be" xmlns:ns3="adccf511-daff-4bcb-9072-914cedbf4c7e" targetNamespace="http://schemas.microsoft.com/office/2006/metadata/properties" ma:root="true" ma:fieldsID="e29002b2d9ca820e89c57fc59ec70c79" ns2:_="" ns3:_="">
+    <xsd:import namespace="a70d3c18-0869-45a1-9f75-4b4b8f0f32be"/>
+    <xsd:import namespace="adccf511-daff-4bcb-9072-914cedbf4c7e"/>
     <xsd:element name="properties">
       <xsd:complexType>
         <xsd:sequence>
           <xsd:element name="documentManagement">
             <xsd:complexType>
               <xsd:all>
-                <xsd:element ref="ns2:SharedWithUsers" minOccurs="0"/>
-                <xsd:element ref="ns2:SharedWithDetails" minOccurs="0"/>
-                <xsd:element ref="ns3:MediaServiceMetadata" minOccurs="0"/>
-                <xsd:element ref="ns3:MediaServiceFastMetadata" minOccurs="0"/>
-                <xsd:element ref="ns3:MediaServiceSearchProperties" minOccurs="0"/>
-                <xsd:element ref="ns3:MediaServiceObjectDetectorVersions" minOccurs="0"/>
-                <xsd:element ref="ns3:MediaServiceDateTaken" minOccurs="0"/>
-                <xsd:element ref="ns3:MediaServiceGenerationTime" minOccurs="0"/>
-                <xsd:element ref="ns3:MediaServiceEventHashCode" minOccurs="0"/>
-                <xsd:element ref="ns3:MediaLengthInSeconds" minOccurs="0"/>
-                <xsd:element ref="ns3:lcf76f155ced4ddcb4097134ff3c332f" minOccurs="0"/>
-                <xsd:element ref="ns2:TaxCatchAll" minOccurs="0"/>
-                <xsd:element ref="ns3:MediaServiceOCR" minOccurs="0"/>
-                <xsd:element ref="ns3:MediaServiceLocation" minOccurs="0"/>
+                <xsd:element ref="ns2:MediaServiceMetadata" minOccurs="0"/>
+                <xsd:element ref="ns2:MediaServiceFastMetadata" minOccurs="0"/>
+                <xsd:element ref="ns2:MediaServiceSearchProperties" minOccurs="0"/>
+                <xsd:element ref="ns2:MediaServiceDateTaken" minOccurs="0"/>
+                <xsd:element ref="ns2:MediaServiceGenerationTime" minOccurs="0"/>
+                <xsd:element ref="ns2:MediaServiceEventHashCode" minOccurs="0"/>
+                <xsd:element ref="ns2:MediaLengthInSeconds" minOccurs="0"/>
+                <xsd:element ref="ns2:lcf76f155ced4ddcb4097134ff3c332f" minOccurs="0"/>
+                <xsd:element ref="ns3:TaxCatchAll" minOccurs="0"/>
+                <xsd:element ref="ns2:MediaServiceOCR" minOccurs="0"/>
+                <xsd:element ref="ns2:MediaServiceBillingMetadata" minOccurs="0"/>
               </xsd:all>
             </xsd:complexType>
           </xsd:element>
@@ -14291,36 +13865,68 @@
       </xsd:complexType>
     </xsd:element>
   </xsd:schema>
-  <xsd:schema xmlns:xsd="http://www.w3.org/2001/XMLSchema" xmlns:xs="http://www.w3.org/2001/XMLSchema" xmlns:dms="http://schemas.microsoft.com/office/2006/documentManagement/types" xmlns:pc="http://schemas.microsoft.com/office/infopath/2007/PartnerControls" targetNamespace="13c90a0b-73bc-4dc0-be5f-28d77b615beb" elementFormDefault="qualified">
+  <xsd:schema xmlns:xsd="http://www.w3.org/2001/XMLSchema" xmlns:xs="http://www.w3.org/2001/XMLSchema" xmlns:dms="http://schemas.microsoft.com/office/2006/documentManagement/types" xmlns:pc="http://schemas.microsoft.com/office/infopath/2007/PartnerControls" targetNamespace="a70d3c18-0869-45a1-9f75-4b4b8f0f32be" elementFormDefault="qualified">
     <xsd:import namespace="http://schemas.microsoft.com/office/2006/documentManagement/types"/>
     <xsd:import namespace="http://schemas.microsoft.com/office/infopath/2007/PartnerControls"/>
-    <xsd:element name="SharedWithUsers" ma:index="8" nillable="true" ma:displayName="Compartido con" ma:internalName="SharedWithUsers" ma:readOnly="true">
+    <xsd:element name="MediaServiceMetadata" ma:index="8" nillable="true" ma:displayName="MediaServiceMetadata" ma:hidden="true" ma:internalName="MediaServiceMetadata" ma:readOnly="true">
+      <xsd:simpleType>
+        <xsd:restriction base="dms:Note"/>
+      </xsd:simpleType>
+    </xsd:element>
+    <xsd:element name="MediaServiceFastMetadata" ma:index="9" nillable="true" ma:displayName="MediaServiceFastMetadata" ma:hidden="true" ma:internalName="MediaServiceFastMetadata" ma:readOnly="true">
+      <xsd:simpleType>
+        <xsd:restriction base="dms:Note"/>
+      </xsd:simpleType>
+    </xsd:element>
+    <xsd:element name="MediaServiceSearchProperties" ma:index="10" nillable="true" ma:displayName="MediaServiceSearchProperties" ma:hidden="true" ma:internalName="MediaServiceSearchProperties" ma:readOnly="true">
+      <xsd:simpleType>
+        <xsd:restriction base="dms:Note"/>
+      </xsd:simpleType>
+    </xsd:element>
+    <xsd:element name="MediaServiceDateTaken" ma:index="11" nillable="true" ma:displayName="MediaServiceDateTaken" ma:hidden="true" ma:indexed="true" ma:internalName="MediaServiceDateTaken" ma:readOnly="true">
+      <xsd:simpleType>
+        <xsd:restriction base="dms:Text"/>
+      </xsd:simpleType>
+    </xsd:element>
+    <xsd:element name="MediaServiceGenerationTime" ma:index="12" nillable="true" ma:displayName="MediaServiceGenerationTime" ma:hidden="true" ma:internalName="MediaServiceGenerationTime" ma:readOnly="true">
+      <xsd:simpleType>
+        <xsd:restriction base="dms:Text"/>
+      </xsd:simpleType>
+    </xsd:element>
+    <xsd:element name="MediaServiceEventHashCode" ma:index="13" nillable="true" ma:displayName="MediaServiceEventHashCode" ma:hidden="true" ma:internalName="MediaServiceEventHashCode" ma:readOnly="true">
+      <xsd:simpleType>
+        <xsd:restriction base="dms:Text"/>
+      </xsd:simpleType>
+    </xsd:element>
+    <xsd:element name="MediaLengthInSeconds" ma:index="14" nillable="true" ma:displayName="MediaLengthInSeconds" ma:hidden="true" ma:internalName="MediaLengthInSeconds" ma:readOnly="true">
+      <xsd:simpleType>
+        <xsd:restriction base="dms:Unknown"/>
+      </xsd:simpleType>
+    </xsd:element>
+    <xsd:element name="lcf76f155ced4ddcb4097134ff3c332f" ma:index="16" nillable="true" ma:taxonomy="true" ma:internalName="lcf76f155ced4ddcb4097134ff3c332f" ma:taxonomyFieldName="MediaServiceImageTags" ma:displayName="Etiquetas de imagen" ma:readOnly="false" ma:fieldId="{5cf76f15-5ced-4ddc-b409-7134ff3c332f}" ma:taxonomyMulti="true" ma:sspId="d33c8c81-5745-4931-bcc4-c2aeafe86780" ma:termSetId="09814cd3-568e-fe90-9814-8d621ff8fb84" ma:anchorId="fba54fb3-c3e1-fe81-a776-ca4b69148c4d" ma:open="true" ma:isKeyword="false">
       <xsd:complexType>
-        <xsd:complexContent>
-          <xsd:extension base="dms:UserMulti">
-            <xsd:sequence>
-              <xsd:element name="UserInfo" minOccurs="0" maxOccurs="unbounded">
-                <xsd:complexType>
-                  <xsd:sequence>
-                    <xsd:element name="DisplayName" type="xsd:string" minOccurs="0"/>
-                    <xsd:element name="AccountId" type="dms:UserId" minOccurs="0" nillable="true"/>
-                    <xsd:element name="AccountType" type="xsd:string" minOccurs="0"/>
-                  </xsd:sequence>
-                </xsd:complexType>
-              </xsd:element>
-            </xsd:sequence>
-          </xsd:extension>
-        </xsd:complexContent>
+        <xsd:sequence>
+          <xsd:element ref="pc:Terms" minOccurs="0" maxOccurs="1"/>
+        </xsd:sequence>
       </xsd:complexType>
     </xsd:element>
-    <xsd:element name="SharedWithDetails" ma:index="9" nillable="true" ma:displayName="Detalles de uso compartido" ma:internalName="SharedWithDetails" ma:readOnly="true">
+    <xsd:element name="MediaServiceOCR" ma:index="18" nillable="true" ma:displayName="Extracted Text" ma:internalName="MediaServiceOCR" ma:readOnly="true">
       <xsd:simpleType>
         <xsd:restriction base="dms:Note">
           <xsd:maxLength value="255"/>
         </xsd:restriction>
       </xsd:simpleType>
     </xsd:element>
-    <xsd:element name="TaxCatchAll" ma:index="20" nillable="true" ma:displayName="Taxonomy Catch All Column" ma:hidden="true" ma:list="{a42ca037-5d13-4729-aeec-4237f141d2d6}" ma:internalName="TaxCatchAll" ma:showField="CatchAllData" ma:web="13c90a0b-73bc-4dc0-be5f-28d77b615beb">
+    <xsd:element name="MediaServiceBillingMetadata" ma:index="19" nillable="true" ma:displayName="MediaServiceBillingMetadata" ma:hidden="true" ma:internalName="MediaServiceBillingMetadata" ma:readOnly="true">
+      <xsd:simpleType>
+        <xsd:restriction base="dms:Note"/>
+      </xsd:simpleType>
+    </xsd:element>
+  </xsd:schema>
+  <xsd:schema xmlns:xsd="http://www.w3.org/2001/XMLSchema" xmlns:xs="http://www.w3.org/2001/XMLSchema" xmlns:dms="http://schemas.microsoft.com/office/2006/documentManagement/types" xmlns:pc="http://schemas.microsoft.com/office/infopath/2007/PartnerControls" targetNamespace="adccf511-daff-4bcb-9072-914cedbf4c7e" elementFormDefault="qualified">
+    <xsd:import namespace="http://schemas.microsoft.com/office/2006/documentManagement/types"/>
+    <xsd:import namespace="http://schemas.microsoft.com/office/infopath/2007/PartnerControls"/>
+    <xsd:element name="TaxCatchAll" ma:index="17" nillable="true" ma:displayName="Taxonomy Catch All Column" ma:hidden="true" ma:list="{d55fdbc5-1632-489d-aeea-ba6fd7407963}" ma:internalName="TaxCatchAll" ma:showField="CatchAllData" ma:web="adccf511-daff-4bcb-9072-914cedbf4c7e">
       <xsd:complexType>
         <xsd:complexContent>
           <xsd:extension base="dms:MultiChoiceLookup">
@@ -14330,69 +13936,6 @@
           </xsd:extension>
         </xsd:complexContent>
       </xsd:complexType>
-    </xsd:element>
-  </xsd:schema>
-  <xsd:schema xmlns:xsd="http://www.w3.org/2001/XMLSchema" xmlns:xs="http://www.w3.org/2001/XMLSchema" xmlns:dms="http://schemas.microsoft.com/office/2006/documentManagement/types" xmlns:pc="http://schemas.microsoft.com/office/infopath/2007/PartnerControls" targetNamespace="13c93bba-48ce-428c-bfe5-88b42c19b028" elementFormDefault="qualified">
-    <xsd:import namespace="http://schemas.microsoft.com/office/2006/documentManagement/types"/>
-    <xsd:import namespace="http://schemas.microsoft.com/office/infopath/2007/PartnerControls"/>
-    <xsd:element name="MediaServiceMetadata" ma:index="10" nillable="true" ma:displayName="MediaServiceMetadata" ma:hidden="true" ma:internalName="MediaServiceMetadata" ma:readOnly="true">
-      <xsd:simpleType>
-        <xsd:restriction base="dms:Note"/>
-      </xsd:simpleType>
-    </xsd:element>
-    <xsd:element name="MediaServiceFastMetadata" ma:index="11" nillable="true" ma:displayName="MediaServiceFastMetadata" ma:hidden="true" ma:internalName="MediaServiceFastMetadata" ma:readOnly="true">
-      <xsd:simpleType>
-        <xsd:restriction base="dms:Note"/>
-      </xsd:simpleType>
-    </xsd:element>
-    <xsd:element name="MediaServiceSearchProperties" ma:index="12" nillable="true" ma:displayName="MediaServiceSearchProperties" ma:hidden="true" ma:internalName="MediaServiceSearchProperties" ma:readOnly="true">
-      <xsd:simpleType>
-        <xsd:restriction base="dms:Note"/>
-      </xsd:simpleType>
-    </xsd:element>
-    <xsd:element name="MediaServiceObjectDetectorVersions" ma:index="13" nillable="true" ma:displayName="MediaServiceObjectDetectorVersions" ma:hidden="true" ma:indexed="true" ma:internalName="MediaServiceObjectDetectorVersions" ma:readOnly="true">
-      <xsd:simpleType>
-        <xsd:restriction base="dms:Text"/>
-      </xsd:simpleType>
-    </xsd:element>
-    <xsd:element name="MediaServiceDateTaken" ma:index="14" nillable="true" ma:displayName="MediaServiceDateTaken" ma:hidden="true" ma:indexed="true" ma:internalName="MediaServiceDateTaken" ma:readOnly="true">
-      <xsd:simpleType>
-        <xsd:restriction base="dms:Text"/>
-      </xsd:simpleType>
-    </xsd:element>
-    <xsd:element name="MediaServiceGenerationTime" ma:index="15" nillable="true" ma:displayName="MediaServiceGenerationTime" ma:hidden="true" ma:internalName="MediaServiceGenerationTime" ma:readOnly="true">
-      <xsd:simpleType>
-        <xsd:restriction base="dms:Text"/>
-      </xsd:simpleType>
-    </xsd:element>
-    <xsd:element name="MediaServiceEventHashCode" ma:index="16" nillable="true" ma:displayName="MediaServiceEventHashCode" ma:hidden="true" ma:internalName="MediaServiceEventHashCode" ma:readOnly="true">
-      <xsd:simpleType>
-        <xsd:restriction base="dms:Text"/>
-      </xsd:simpleType>
-    </xsd:element>
-    <xsd:element name="MediaLengthInSeconds" ma:index="17" nillable="true" ma:displayName="MediaLengthInSeconds" ma:hidden="true" ma:internalName="MediaLengthInSeconds" ma:readOnly="true">
-      <xsd:simpleType>
-        <xsd:restriction base="dms:Unknown"/>
-      </xsd:simpleType>
-    </xsd:element>
-    <xsd:element name="lcf76f155ced4ddcb4097134ff3c332f" ma:index="19" nillable="true" ma:taxonomy="true" ma:internalName="lcf76f155ced4ddcb4097134ff3c332f" ma:taxonomyFieldName="MediaServiceImageTags" ma:displayName="Etiquetas de imagen" ma:readOnly="false" ma:fieldId="{5cf76f15-5ced-4ddc-b409-7134ff3c332f}" ma:taxonomyMulti="true" ma:sspId="d33c8c81-5745-4931-bcc4-c2aeafe86780" ma:termSetId="09814cd3-568e-fe90-9814-8d621ff8fb84" ma:anchorId="fba54fb3-c3e1-fe81-a776-ca4b69148c4d" ma:open="true" ma:isKeyword="false">
-      <xsd:complexType>
-        <xsd:sequence>
-          <xsd:element ref="pc:Terms" minOccurs="0" maxOccurs="1"/>
-        </xsd:sequence>
-      </xsd:complexType>
-    </xsd:element>
-    <xsd:element name="MediaServiceOCR" ma:index="21" nillable="true" ma:displayName="Extracted Text" ma:internalName="MediaServiceOCR" ma:readOnly="true">
-      <xsd:simpleType>
-        <xsd:restriction base="dms:Note">
-          <xsd:maxLength value="255"/>
-        </xsd:restriction>
-      </xsd:simpleType>
-    </xsd:element>
-    <xsd:element name="MediaServiceLocation" ma:index="22" nillable="true" ma:displayName="Location" ma:description="" ma:indexed="true" ma:internalName="MediaServiceLocation" ma:readOnly="true">
-      <xsd:simpleType>
-        <xsd:restriction base="dms:Text"/>
-      </xsd:simpleType>
     </xsd:element>
   </xsd:schema>
   <xsd:schema xmlns="http://schemas.openxmlformats.org/package/2006/metadata/core-properties" xmlns:xsd="http://www.w3.org/2001/XMLSchema" xmlns:xsi="http://www.w3.org/2001/XMLSchema-instance" xmlns:dc="http://purl.org/dc/elements/1.1/" xmlns:dcterms="http://purl.org/dc/terms/" xmlns:odoc="http://schemas.microsoft.com/internal/obd" targetNamespace="http://schemas.openxmlformats.org/package/2006/metadata/core-properties" elementFormDefault="qualified" attributeFormDefault="unqualified" blockDefault="#all">
@@ -14501,8 +14044,8 @@
 <file path=customXml/item3.xml><?xml version="1.0" encoding="utf-8"?>
 <p:properties xmlns:p="http://schemas.microsoft.com/office/2006/metadata/properties" xmlns:xsi="http://www.w3.org/2001/XMLSchema-instance" xmlns:pc="http://schemas.microsoft.com/office/infopath/2007/PartnerControls">
   <documentManagement>
-    <TaxCatchAll xmlns="13c90a0b-73bc-4dc0-be5f-28d77b615beb" xsi:nil="true"/>
-    <lcf76f155ced4ddcb4097134ff3c332f xmlns="13c93bba-48ce-428c-bfe5-88b42c19b028">
+    <TaxCatchAll xmlns="adccf511-daff-4bcb-9072-914cedbf4c7e" xsi:nil="true"/>
+    <lcf76f155ced4ddcb4097134ff3c332f xmlns="a70d3c18-0869-45a1-9f75-4b4b8f0f32be">
       <Terms xmlns="http://schemas.microsoft.com/office/infopath/2007/PartnerControls"/>
     </lcf76f155ced4ddcb4097134ff3c332f>
   </documentManagement>
@@ -14519,7 +14062,22 @@
 </file>
 
 <file path=customXml/itemProps1.xml><?xml version="1.0" encoding="utf-8"?>
-<ds:datastoreItem xmlns:ds="http://schemas.openxmlformats.org/officeDocument/2006/customXml" ds:itemID="{2BDB437B-E46E-4A9F-B842-16916B1CE8C9}"/>
+<ds:datastoreItem xmlns:ds="http://schemas.openxmlformats.org/officeDocument/2006/customXml" ds:itemID="{996434B9-CC1E-4468-A086-AA07C2AF1350}">
+  <ds:schemaRefs>
+    <ds:schemaRef ds:uri="http://schemas.microsoft.com/office/2006/metadata/contentType"/>
+    <ds:schemaRef ds:uri="http://schemas.microsoft.com/office/2006/metadata/properties/metaAttributes"/>
+    <ds:schemaRef ds:uri="http://www.w3.org/2001/XMLSchema"/>
+    <ds:schemaRef ds:uri="http://schemas.microsoft.com/office/2006/metadata/properties"/>
+    <ds:schemaRef ds:uri="a70d3c18-0869-45a1-9f75-4b4b8f0f32be"/>
+    <ds:schemaRef ds:uri="adccf511-daff-4bcb-9072-914cedbf4c7e"/>
+    <ds:schemaRef ds:uri="http://schemas.microsoft.com/office/2006/documentManagement/types"/>
+    <ds:schemaRef ds:uri="http://schemas.microsoft.com/office/infopath/2007/PartnerControls"/>
+    <ds:schemaRef ds:uri="http://schemas.openxmlformats.org/package/2006/metadata/core-properties"/>
+    <ds:schemaRef ds:uri="http://purl.org/dc/elements/1.1/"/>
+    <ds:schemaRef ds:uri="http://purl.org/dc/terms/"/>
+    <ds:schemaRef ds:uri="http://schemas.microsoft.com/internal/obd"/>
+  </ds:schemaRefs>
+</ds:datastoreItem>
 </file>
 
 <file path=customXml/itemProps2.xml><?xml version="1.0" encoding="utf-8"?>

</xml_diff>